<commit_message>
3NF has no transitive dependencies
</commit_message>
<xml_diff>
--- a/Applied/App04/at4_normalisation.docx
+++ b/Applied/App04/at4_normalisation.docx
@@ -4,74 +4,1665 @@
   <w:body>
     <w:p>
       <w:pPr>
-        <w:rPr>
-          <w:rFonts w:asciiTheme="majorBidi" w:hAnsiTheme="majorBidi"/>
-          <w:u w:val="single"/>
-          <w:lang w:val="en-US"/>
-        </w:rPr>
-      </w:pPr>
-      <w:r>
-        <w:rPr>
-          <w:rFonts w:asciiTheme="majorBidi" w:hAnsiTheme="majorBidi"/>
-          <w:u w:val="single"/>
-          <w:lang w:val="en-US"/>
-        </w:rPr>
-        <w:t xml:space="preserve">Applied Task 4 </w:t>
-      </w:r>
-      <w:r>
-        <w:rPr>
-          <w:rFonts w:asciiTheme="majorBidi" w:hAnsiTheme="majorBidi"/>
-          <w:u w:val="single"/>
-          <w:lang w:val="en-US"/>
-        </w:rPr>
-        <w:t>–</w:t>
-      </w:r>
-      <w:r>
-        <w:rPr>
-          <w:rFonts w:asciiTheme="majorBidi" w:hAnsiTheme="majorBidi"/>
-          <w:u w:val="single"/>
-          <w:lang w:val="en-US"/>
-        </w:rPr>
-        <w:t xml:space="preserve"> </w:t>
-      </w:r>
-      <w:proofErr w:type="spellStart"/>
-      <w:r>
-        <w:rPr>
-          <w:rFonts w:asciiTheme="majorBidi" w:hAnsiTheme="majorBidi"/>
-          <w:u w:val="single"/>
-          <w:lang w:val="en-US"/>
-        </w:rPr>
-        <w:t>Normalisation</w:t>
-      </w:r>
-      <w:proofErr w:type="spellEnd"/>
-    </w:p>
-    <w:p>
-      <w:pPr>
-        <w:rPr>
-          <w:rFonts w:asciiTheme="majorBidi" w:hAnsiTheme="majorBidi"/>
-          <w:u w:val="single"/>
-          <w:lang w:val="en-US"/>
-        </w:rPr>
-      </w:pPr>
-    </w:p>
-    <w:p>
-      <w:pPr>
-        <w:rPr>
-          <w:rFonts w:asciiTheme="majorBidi" w:hAnsiTheme="majorBidi"/>
+        <w:spacing w:after="0" w:line="240" w:lineRule="auto"/>
+        <w:rPr>
+          <w:rFonts w:ascii="Calibri" w:hAnsi="Calibri" w:cs="Calibri"/>
           <w:b/>
           <w:bCs/>
-          <w:lang w:val="en-US"/>
-        </w:rPr>
-      </w:pPr>
-      <w:r>
-        <w:rPr>
-          <w:rFonts w:asciiTheme="majorBidi" w:hAnsiTheme="majorBidi"/>
+          <w:sz w:val="22"/>
+          <w:szCs w:val="22"/>
+          <w:lang w:val="en-US"/>
+        </w:rPr>
+      </w:pPr>
+      <w:r>
+        <w:rPr>
+          <w:rFonts w:ascii="Calibri" w:hAnsi="Calibri" w:cs="Calibri"/>
           <w:b/>
           <w:bCs/>
-          <w:lang w:val="en-US"/>
-        </w:rPr>
-        <w:t>UNF</w:t>
-      </w:r>
+          <w:sz w:val="22"/>
+          <w:szCs w:val="22"/>
+          <w:lang w:val="en-US"/>
+        </w:rPr>
+        <w:t xml:space="preserve">Applied Task 4 – </w:t>
+      </w:r>
+      <w:proofErr w:type="spellStart"/>
+      <w:r>
+        <w:rPr>
+          <w:rFonts w:ascii="Calibri" w:hAnsi="Calibri" w:cs="Calibri"/>
+          <w:b/>
+          <w:bCs/>
+          <w:sz w:val="22"/>
+          <w:szCs w:val="22"/>
+          <w:lang w:val="en-US"/>
+        </w:rPr>
+        <w:t>Normalisation</w:t>
+      </w:r>
+      <w:proofErr w:type="spellEnd"/>
+      <w:r>
+        <w:rPr>
+          <w:rFonts w:ascii="Calibri" w:hAnsi="Calibri" w:cs="Calibri"/>
+          <w:b/>
+          <w:bCs/>
+          <w:sz w:val="22"/>
+          <w:szCs w:val="22"/>
+          <w:lang w:val="en-US"/>
+        </w:rPr>
+        <w:t xml:space="preserve"> </w:t>
+      </w:r>
+      <w:r>
+        <w:rPr>
+          <w:rFonts w:ascii="Calibri" w:hAnsi="Calibri" w:cs="Calibri"/>
+          <w:b/>
+          <w:bCs/>
+          <w:sz w:val="22"/>
+          <w:szCs w:val="22"/>
+          <w:lang w:val="en-US"/>
+        </w:rPr>
+        <w:tab/>
+      </w:r>
+      <w:r>
+        <w:rPr>
+          <w:rFonts w:ascii="Calibri" w:hAnsi="Calibri" w:cs="Calibri"/>
+          <w:b/>
+          <w:bCs/>
+          <w:sz w:val="22"/>
+          <w:szCs w:val="22"/>
+          <w:lang w:val="en-US"/>
+        </w:rPr>
+        <w:tab/>
+      </w:r>
+      <w:r>
+        <w:rPr>
+          <w:rFonts w:ascii="Calibri" w:hAnsi="Calibri" w:cs="Calibri"/>
+          <w:b/>
+          <w:bCs/>
+          <w:sz w:val="22"/>
+          <w:szCs w:val="22"/>
+          <w:lang w:val="en-US"/>
+        </w:rPr>
+        <w:tab/>
+        <w:t>Ria Bansal (34267433)</w:t>
+      </w:r>
+    </w:p>
+    <w:p>
+      <w:pPr>
+        <w:spacing w:after="0" w:line="240" w:lineRule="auto"/>
+        <w:rPr>
+          <w:rFonts w:ascii="Calibri" w:hAnsi="Calibri" w:cs="Calibri"/>
+          <w:sz w:val="22"/>
+          <w:szCs w:val="22"/>
+          <w:lang w:val="en-US"/>
+        </w:rPr>
+      </w:pPr>
+    </w:p>
+    <w:p>
+      <w:pPr>
+        <w:spacing w:after="0" w:line="240" w:lineRule="auto"/>
+        <w:rPr>
+          <w:rFonts w:ascii="Calibri" w:hAnsi="Calibri" w:cs="Calibri"/>
+          <w:b/>
+          <w:bCs/>
+          <w:sz w:val="22"/>
+          <w:szCs w:val="22"/>
+          <w:lang w:val="en-US"/>
+        </w:rPr>
+      </w:pPr>
+      <w:r>
+        <w:rPr>
+          <w:rFonts w:ascii="Calibri" w:hAnsi="Calibri" w:cs="Calibri"/>
+          <w:b/>
+          <w:bCs/>
+          <w:sz w:val="22"/>
+          <w:szCs w:val="22"/>
+          <w:lang w:val="en-US"/>
+        </w:rPr>
+        <w:t xml:space="preserve">UNF  </w:t>
+      </w:r>
+    </w:p>
+    <w:p>
+      <w:pPr>
+        <w:spacing w:after="0" w:line="240" w:lineRule="auto"/>
+        <w:rPr>
+          <w:rFonts w:ascii="Calibri" w:hAnsi="Calibri" w:cs="Calibri"/>
+          <w:sz w:val="22"/>
+          <w:szCs w:val="22"/>
+          <w:lang w:val="en-US"/>
+        </w:rPr>
+      </w:pPr>
+      <w:proofErr w:type="gramStart"/>
+      <w:r>
+        <w:rPr>
+          <w:rFonts w:ascii="Calibri" w:hAnsi="Calibri" w:cs="Calibri"/>
+          <w:sz w:val="22"/>
+          <w:szCs w:val="22"/>
+          <w:lang w:val="en-US"/>
+        </w:rPr>
+        <w:t>SALESREP(</w:t>
+      </w:r>
+      <w:proofErr w:type="spellStart"/>
+      <w:proofErr w:type="gramEnd"/>
+      <w:r>
+        <w:rPr>
+          <w:rFonts w:ascii="Calibri" w:hAnsi="Calibri" w:cs="Calibri"/>
+          <w:sz w:val="22"/>
+          <w:szCs w:val="22"/>
+          <w:lang w:val="en-US"/>
+        </w:rPr>
+        <w:t>salesrep_id</w:t>
+      </w:r>
+      <w:proofErr w:type="spellEnd"/>
+      <w:r>
+        <w:rPr>
+          <w:rFonts w:ascii="Calibri" w:hAnsi="Calibri" w:cs="Calibri"/>
+          <w:sz w:val="22"/>
+          <w:szCs w:val="22"/>
+          <w:lang w:val="en-US"/>
+        </w:rPr>
+        <w:t xml:space="preserve">, </w:t>
+      </w:r>
+      <w:proofErr w:type="spellStart"/>
+      <w:r>
+        <w:rPr>
+          <w:rFonts w:ascii="Calibri" w:hAnsi="Calibri" w:cs="Calibri"/>
+          <w:sz w:val="22"/>
+          <w:szCs w:val="22"/>
+          <w:lang w:val="en-US"/>
+        </w:rPr>
+        <w:t>salesrep_name</w:t>
+      </w:r>
+      <w:proofErr w:type="spellEnd"/>
+      <w:r>
+        <w:rPr>
+          <w:rFonts w:ascii="Calibri" w:hAnsi="Calibri" w:cs="Calibri"/>
+          <w:sz w:val="22"/>
+          <w:szCs w:val="22"/>
+          <w:lang w:val="en-US"/>
+        </w:rPr>
+        <w:t xml:space="preserve">, </w:t>
+      </w:r>
+      <w:proofErr w:type="spellStart"/>
+      <w:r>
+        <w:rPr>
+          <w:rFonts w:ascii="Calibri" w:hAnsi="Calibri" w:cs="Calibri"/>
+          <w:sz w:val="22"/>
+          <w:szCs w:val="22"/>
+          <w:lang w:val="en-US"/>
+        </w:rPr>
+        <w:t>salesrep_mobile</w:t>
+      </w:r>
+      <w:proofErr w:type="spellEnd"/>
+      <w:r>
+        <w:rPr>
+          <w:rFonts w:ascii="Calibri" w:hAnsi="Calibri" w:cs="Calibri"/>
+          <w:sz w:val="22"/>
+          <w:szCs w:val="22"/>
+          <w:lang w:val="en-US"/>
+        </w:rPr>
+        <w:t xml:space="preserve">, </w:t>
+      </w:r>
+      <w:proofErr w:type="spellStart"/>
+      <w:r>
+        <w:rPr>
+          <w:rFonts w:ascii="Calibri" w:hAnsi="Calibri" w:cs="Calibri"/>
+          <w:sz w:val="22"/>
+          <w:szCs w:val="22"/>
+          <w:lang w:val="en-US"/>
+        </w:rPr>
+        <w:t>branch_id</w:t>
+      </w:r>
+      <w:proofErr w:type="spellEnd"/>
+      <w:r>
+        <w:rPr>
+          <w:rFonts w:ascii="Calibri" w:hAnsi="Calibri" w:cs="Calibri"/>
+          <w:sz w:val="22"/>
+          <w:szCs w:val="22"/>
+          <w:lang w:val="en-US"/>
+        </w:rPr>
+        <w:t xml:space="preserve">, </w:t>
+      </w:r>
+      <w:proofErr w:type="spellStart"/>
+      <w:r>
+        <w:rPr>
+          <w:rFonts w:ascii="Calibri" w:hAnsi="Calibri" w:cs="Calibri"/>
+          <w:sz w:val="22"/>
+          <w:szCs w:val="22"/>
+          <w:lang w:val="en-US"/>
+        </w:rPr>
+        <w:t>branch_name</w:t>
+      </w:r>
+      <w:proofErr w:type="spellEnd"/>
+      <w:r>
+        <w:rPr>
+          <w:rFonts w:ascii="Calibri" w:hAnsi="Calibri" w:cs="Calibri"/>
+          <w:sz w:val="22"/>
+          <w:szCs w:val="22"/>
+          <w:lang w:val="en-US"/>
+        </w:rPr>
+        <w:t xml:space="preserve">, </w:t>
+      </w:r>
+      <w:proofErr w:type="spellStart"/>
+      <w:r>
+        <w:rPr>
+          <w:rFonts w:ascii="Calibri" w:hAnsi="Calibri" w:cs="Calibri"/>
+          <w:sz w:val="22"/>
+          <w:szCs w:val="22"/>
+          <w:lang w:val="en-US"/>
+        </w:rPr>
+        <w:t>drug_code</w:t>
+      </w:r>
+      <w:proofErr w:type="spellEnd"/>
+      <w:r>
+        <w:rPr>
+          <w:rFonts w:ascii="Calibri" w:hAnsi="Calibri" w:cs="Calibri"/>
+          <w:sz w:val="22"/>
+          <w:szCs w:val="22"/>
+          <w:lang w:val="en-US"/>
+        </w:rPr>
+        <w:t xml:space="preserve">, </w:t>
+      </w:r>
+      <w:proofErr w:type="spellStart"/>
+      <w:r>
+        <w:rPr>
+          <w:rFonts w:ascii="Calibri" w:hAnsi="Calibri" w:cs="Calibri"/>
+          <w:sz w:val="22"/>
+          <w:szCs w:val="22"/>
+          <w:lang w:val="en-US"/>
+        </w:rPr>
+        <w:t>drug_name</w:t>
+      </w:r>
+      <w:proofErr w:type="spellEnd"/>
+      <w:r>
+        <w:rPr>
+          <w:rFonts w:ascii="Calibri" w:hAnsi="Calibri" w:cs="Calibri"/>
+          <w:sz w:val="22"/>
+          <w:szCs w:val="22"/>
+          <w:lang w:val="en-US"/>
+        </w:rPr>
+        <w:t xml:space="preserve">, </w:t>
+      </w:r>
+      <w:proofErr w:type="spellStart"/>
+      <w:r>
+        <w:rPr>
+          <w:rFonts w:ascii="Calibri" w:hAnsi="Calibri" w:cs="Calibri"/>
+          <w:sz w:val="22"/>
+          <w:szCs w:val="22"/>
+          <w:lang w:val="en-US"/>
+        </w:rPr>
+        <w:t>date_assigned</w:t>
+      </w:r>
+      <w:proofErr w:type="spellEnd"/>
+      <w:r>
+        <w:rPr>
+          <w:rFonts w:ascii="Calibri" w:hAnsi="Calibri" w:cs="Calibri"/>
+          <w:sz w:val="22"/>
+          <w:szCs w:val="22"/>
+          <w:lang w:val="en-US"/>
+        </w:rPr>
+        <w:t>)</w:t>
+      </w:r>
+    </w:p>
+    <w:p>
+      <w:pPr>
+        <w:spacing w:after="0" w:line="240" w:lineRule="auto"/>
+        <w:rPr>
+          <w:rFonts w:ascii="Calibri" w:hAnsi="Calibri" w:cs="Calibri"/>
+          <w:sz w:val="22"/>
+          <w:szCs w:val="22"/>
+          <w:lang w:val="en-US"/>
+        </w:rPr>
+      </w:pPr>
+    </w:p>
+    <w:p>
+      <w:pPr>
+        <w:spacing w:after="0" w:line="240" w:lineRule="auto"/>
+        <w:rPr>
+          <w:rFonts w:ascii="Calibri" w:hAnsi="Calibri" w:cs="Calibri"/>
+          <w:b/>
+          <w:bCs/>
+          <w:sz w:val="22"/>
+          <w:szCs w:val="22"/>
+          <w:lang w:val="en-US"/>
+        </w:rPr>
+      </w:pPr>
+      <w:r>
+        <w:rPr>
+          <w:rFonts w:ascii="Calibri" w:hAnsi="Calibri" w:cs="Calibri"/>
+          <w:b/>
+          <w:bCs/>
+          <w:sz w:val="22"/>
+          <w:szCs w:val="22"/>
+          <w:lang w:val="en-US"/>
+        </w:rPr>
+        <w:t xml:space="preserve">1NF  </w:t>
+      </w:r>
+    </w:p>
+    <w:p>
+      <w:pPr>
+        <w:spacing w:after="0" w:line="240" w:lineRule="auto"/>
+        <w:rPr>
+          <w:rFonts w:ascii="Calibri" w:hAnsi="Calibri" w:cs="Calibri"/>
+          <w:sz w:val="22"/>
+          <w:szCs w:val="22"/>
+          <w:lang w:val="en-US"/>
+        </w:rPr>
+      </w:pPr>
+      <w:proofErr w:type="gramStart"/>
+      <w:r>
+        <w:rPr>
+          <w:rFonts w:ascii="Calibri" w:hAnsi="Calibri" w:cs="Calibri"/>
+          <w:sz w:val="22"/>
+          <w:szCs w:val="22"/>
+          <w:lang w:val="en-US"/>
+        </w:rPr>
+        <w:t>SALESREP(</w:t>
+      </w:r>
+      <w:proofErr w:type="spellStart"/>
+      <w:proofErr w:type="gramEnd"/>
+      <w:r>
+        <w:rPr>
+          <w:rFonts w:ascii="Calibri" w:hAnsi="Calibri" w:cs="Calibri"/>
+          <w:sz w:val="22"/>
+          <w:szCs w:val="22"/>
+          <w:lang w:val="en-US"/>
+        </w:rPr>
+        <w:t>salesrep_id</w:t>
+      </w:r>
+      <w:proofErr w:type="spellEnd"/>
+      <w:r>
+        <w:rPr>
+          <w:rFonts w:ascii="Calibri" w:hAnsi="Calibri" w:cs="Calibri"/>
+          <w:sz w:val="22"/>
+          <w:szCs w:val="22"/>
+          <w:lang w:val="en-US"/>
+        </w:rPr>
+        <w:t xml:space="preserve">, </w:t>
+      </w:r>
+      <w:proofErr w:type="spellStart"/>
+      <w:r>
+        <w:rPr>
+          <w:rFonts w:ascii="Calibri" w:hAnsi="Calibri" w:cs="Calibri"/>
+          <w:sz w:val="22"/>
+          <w:szCs w:val="22"/>
+          <w:lang w:val="en-US"/>
+        </w:rPr>
+        <w:t>salesrep_name</w:t>
+      </w:r>
+      <w:proofErr w:type="spellEnd"/>
+      <w:r>
+        <w:rPr>
+          <w:rFonts w:ascii="Calibri" w:hAnsi="Calibri" w:cs="Calibri"/>
+          <w:sz w:val="22"/>
+          <w:szCs w:val="22"/>
+          <w:lang w:val="en-US"/>
+        </w:rPr>
+        <w:t xml:space="preserve">, </w:t>
+      </w:r>
+      <w:proofErr w:type="spellStart"/>
+      <w:r>
+        <w:rPr>
+          <w:rFonts w:ascii="Calibri" w:hAnsi="Calibri" w:cs="Calibri"/>
+          <w:sz w:val="22"/>
+          <w:szCs w:val="22"/>
+          <w:lang w:val="en-US"/>
+        </w:rPr>
+        <w:t>salesrep_mobile</w:t>
+      </w:r>
+      <w:proofErr w:type="spellEnd"/>
+      <w:r>
+        <w:rPr>
+          <w:rFonts w:ascii="Calibri" w:hAnsi="Calibri" w:cs="Calibri"/>
+          <w:sz w:val="22"/>
+          <w:szCs w:val="22"/>
+          <w:lang w:val="en-US"/>
+        </w:rPr>
+        <w:t xml:space="preserve">, </w:t>
+      </w:r>
+      <w:proofErr w:type="spellStart"/>
+      <w:r>
+        <w:rPr>
+          <w:rFonts w:ascii="Calibri" w:hAnsi="Calibri" w:cs="Calibri"/>
+          <w:sz w:val="22"/>
+          <w:szCs w:val="22"/>
+          <w:lang w:val="en-US"/>
+        </w:rPr>
+        <w:t>branch_id</w:t>
+      </w:r>
+      <w:proofErr w:type="spellEnd"/>
+      <w:r>
+        <w:rPr>
+          <w:rFonts w:ascii="Calibri" w:hAnsi="Calibri" w:cs="Calibri"/>
+          <w:sz w:val="22"/>
+          <w:szCs w:val="22"/>
+          <w:lang w:val="en-US"/>
+        </w:rPr>
+        <w:t xml:space="preserve">, </w:t>
+      </w:r>
+      <w:proofErr w:type="spellStart"/>
+      <w:r>
+        <w:rPr>
+          <w:rFonts w:ascii="Calibri" w:hAnsi="Calibri" w:cs="Calibri"/>
+          <w:sz w:val="22"/>
+          <w:szCs w:val="22"/>
+          <w:lang w:val="en-US"/>
+        </w:rPr>
+        <w:t>branch_name</w:t>
+      </w:r>
+      <w:proofErr w:type="spellEnd"/>
+      <w:r>
+        <w:rPr>
+          <w:rFonts w:ascii="Calibri" w:hAnsi="Calibri" w:cs="Calibri"/>
+          <w:sz w:val="22"/>
+          <w:szCs w:val="22"/>
+          <w:lang w:val="en-US"/>
+        </w:rPr>
+        <w:t xml:space="preserve">)  </w:t>
+      </w:r>
+    </w:p>
+    <w:p>
+      <w:pPr>
+        <w:spacing w:after="0" w:line="240" w:lineRule="auto"/>
+        <w:rPr>
+          <w:rFonts w:ascii="Calibri" w:hAnsi="Calibri" w:cs="Calibri"/>
+          <w:sz w:val="22"/>
+          <w:szCs w:val="22"/>
+          <w:lang w:val="en-US"/>
+        </w:rPr>
+      </w:pPr>
+      <w:r>
+        <w:rPr>
+          <w:rFonts w:ascii="Calibri" w:hAnsi="Calibri" w:cs="Calibri"/>
+          <w:sz w:val="22"/>
+          <w:szCs w:val="22"/>
+          <w:lang w:val="en-US"/>
+        </w:rPr>
+        <w:t>SALESREP_</w:t>
+      </w:r>
+      <w:proofErr w:type="gramStart"/>
+      <w:r>
+        <w:rPr>
+          <w:rFonts w:ascii="Calibri" w:hAnsi="Calibri" w:cs="Calibri"/>
+          <w:sz w:val="22"/>
+          <w:szCs w:val="22"/>
+          <w:lang w:val="en-US"/>
+        </w:rPr>
+        <w:t>DRUG(</w:t>
+      </w:r>
+      <w:proofErr w:type="spellStart"/>
+      <w:proofErr w:type="gramEnd"/>
+      <w:r>
+        <w:rPr>
+          <w:rFonts w:ascii="Calibri" w:hAnsi="Calibri" w:cs="Calibri"/>
+          <w:sz w:val="22"/>
+          <w:szCs w:val="22"/>
+          <w:lang w:val="en-US"/>
+        </w:rPr>
+        <w:t>salesrep_id</w:t>
+      </w:r>
+      <w:proofErr w:type="spellEnd"/>
+      <w:r>
+        <w:rPr>
+          <w:rFonts w:ascii="Calibri" w:hAnsi="Calibri" w:cs="Calibri"/>
+          <w:sz w:val="22"/>
+          <w:szCs w:val="22"/>
+          <w:lang w:val="en-US"/>
+        </w:rPr>
+        <w:t xml:space="preserve">, </w:t>
+      </w:r>
+      <w:proofErr w:type="spellStart"/>
+      <w:r>
+        <w:rPr>
+          <w:rFonts w:ascii="Calibri" w:hAnsi="Calibri" w:cs="Calibri"/>
+          <w:sz w:val="22"/>
+          <w:szCs w:val="22"/>
+          <w:lang w:val="en-US"/>
+        </w:rPr>
+        <w:t>drug_code</w:t>
+      </w:r>
+      <w:proofErr w:type="spellEnd"/>
+      <w:r>
+        <w:rPr>
+          <w:rFonts w:ascii="Calibri" w:hAnsi="Calibri" w:cs="Calibri"/>
+          <w:sz w:val="22"/>
+          <w:szCs w:val="22"/>
+          <w:lang w:val="en-US"/>
+        </w:rPr>
+        <w:t xml:space="preserve">, </w:t>
+      </w:r>
+      <w:proofErr w:type="spellStart"/>
+      <w:r>
+        <w:rPr>
+          <w:rFonts w:ascii="Calibri" w:hAnsi="Calibri" w:cs="Calibri"/>
+          <w:sz w:val="22"/>
+          <w:szCs w:val="22"/>
+          <w:lang w:val="en-US"/>
+        </w:rPr>
+        <w:t>drug_name</w:t>
+      </w:r>
+      <w:proofErr w:type="spellEnd"/>
+      <w:r>
+        <w:rPr>
+          <w:rFonts w:ascii="Calibri" w:hAnsi="Calibri" w:cs="Calibri"/>
+          <w:sz w:val="22"/>
+          <w:szCs w:val="22"/>
+          <w:lang w:val="en-US"/>
+        </w:rPr>
+        <w:t xml:space="preserve">, </w:t>
+      </w:r>
+      <w:proofErr w:type="spellStart"/>
+      <w:r>
+        <w:rPr>
+          <w:rFonts w:ascii="Calibri" w:hAnsi="Calibri" w:cs="Calibri"/>
+          <w:sz w:val="22"/>
+          <w:szCs w:val="22"/>
+          <w:lang w:val="en-US"/>
+        </w:rPr>
+        <w:t>date_assigned</w:t>
+      </w:r>
+      <w:proofErr w:type="spellEnd"/>
+      <w:r>
+        <w:rPr>
+          <w:rFonts w:ascii="Calibri" w:hAnsi="Calibri" w:cs="Calibri"/>
+          <w:sz w:val="22"/>
+          <w:szCs w:val="22"/>
+          <w:lang w:val="en-US"/>
+        </w:rPr>
+        <w:t xml:space="preserve">)  </w:t>
+      </w:r>
+    </w:p>
+    <w:p>
+      <w:pPr>
+        <w:spacing w:after="0" w:line="240" w:lineRule="auto"/>
+        <w:rPr>
+          <w:rFonts w:ascii="Calibri" w:hAnsi="Calibri" w:cs="Calibri"/>
+          <w:sz w:val="22"/>
+          <w:szCs w:val="22"/>
+          <w:lang w:val="en-US"/>
+        </w:rPr>
+      </w:pPr>
+    </w:p>
+    <w:p>
+      <w:pPr>
+        <w:spacing w:after="0" w:line="240" w:lineRule="auto"/>
+        <w:rPr>
+          <w:rFonts w:ascii="Calibri" w:hAnsi="Calibri" w:cs="Calibri"/>
+          <w:b/>
+          <w:bCs/>
+          <w:sz w:val="22"/>
+          <w:szCs w:val="22"/>
+          <w:lang w:val="en-US"/>
+        </w:rPr>
+      </w:pPr>
+      <w:r>
+        <w:rPr>
+          <w:rFonts w:ascii="Calibri" w:hAnsi="Calibri" w:cs="Calibri"/>
+          <w:b/>
+          <w:bCs/>
+          <w:sz w:val="22"/>
+          <w:szCs w:val="22"/>
+          <w:lang w:val="en-US"/>
+        </w:rPr>
+        <w:t xml:space="preserve">CK:  </w:t>
+      </w:r>
+    </w:p>
+    <w:p>
+      <w:pPr>
+        <w:spacing w:after="0" w:line="240" w:lineRule="auto"/>
+        <w:rPr>
+          <w:rFonts w:ascii="Calibri" w:hAnsi="Calibri" w:cs="Calibri"/>
+          <w:sz w:val="22"/>
+          <w:szCs w:val="22"/>
+          <w:lang w:val="en-US"/>
+        </w:rPr>
+      </w:pPr>
+      <w:r>
+        <w:rPr>
+          <w:rFonts w:ascii="Calibri" w:hAnsi="Calibri" w:cs="Calibri"/>
+          <w:sz w:val="22"/>
+          <w:szCs w:val="22"/>
+          <w:lang w:val="en-US"/>
+        </w:rPr>
+        <w:t xml:space="preserve">SALESREP: </w:t>
+      </w:r>
+      <w:proofErr w:type="spellStart"/>
+      <w:r>
+        <w:rPr>
+          <w:rFonts w:ascii="Calibri" w:hAnsi="Calibri" w:cs="Calibri"/>
+          <w:sz w:val="22"/>
+          <w:szCs w:val="22"/>
+          <w:lang w:val="en-US"/>
+        </w:rPr>
+        <w:t>salesrep_id</w:t>
+      </w:r>
+      <w:proofErr w:type="spellEnd"/>
+      <w:r>
+        <w:rPr>
+          <w:rFonts w:ascii="Calibri" w:hAnsi="Calibri" w:cs="Calibri"/>
+          <w:sz w:val="22"/>
+          <w:szCs w:val="22"/>
+          <w:lang w:val="en-US"/>
+        </w:rPr>
+        <w:t xml:space="preserve">, </w:t>
+      </w:r>
+      <w:proofErr w:type="spellStart"/>
+      <w:r>
+        <w:rPr>
+          <w:rFonts w:ascii="Calibri" w:hAnsi="Calibri" w:cs="Calibri"/>
+          <w:sz w:val="22"/>
+          <w:szCs w:val="22"/>
+          <w:lang w:val="en-US"/>
+        </w:rPr>
+        <w:t>salesrep_mobile</w:t>
+      </w:r>
+      <w:proofErr w:type="spellEnd"/>
+      <w:r>
+        <w:rPr>
+          <w:rFonts w:ascii="Calibri" w:hAnsi="Calibri" w:cs="Calibri"/>
+          <w:sz w:val="22"/>
+          <w:szCs w:val="22"/>
+          <w:lang w:val="en-US"/>
+        </w:rPr>
+        <w:t xml:space="preserve">  </w:t>
+      </w:r>
+    </w:p>
+    <w:p>
+      <w:pPr>
+        <w:spacing w:after="0" w:line="240" w:lineRule="auto"/>
+        <w:rPr>
+          <w:rFonts w:ascii="Calibri" w:hAnsi="Calibri" w:cs="Calibri"/>
+          <w:sz w:val="22"/>
+          <w:szCs w:val="22"/>
+          <w:lang w:val="en-US"/>
+        </w:rPr>
+      </w:pPr>
+      <w:r>
+        <w:rPr>
+          <w:rFonts w:ascii="Calibri" w:hAnsi="Calibri" w:cs="Calibri"/>
+          <w:sz w:val="22"/>
+          <w:szCs w:val="22"/>
+          <w:lang w:val="en-US"/>
+        </w:rPr>
+        <w:t>SALESREP_DRUG: (</w:t>
+      </w:r>
+      <w:proofErr w:type="spellStart"/>
+      <w:r>
+        <w:rPr>
+          <w:rFonts w:ascii="Calibri" w:hAnsi="Calibri" w:cs="Calibri"/>
+          <w:sz w:val="22"/>
+          <w:szCs w:val="22"/>
+          <w:lang w:val="en-US"/>
+        </w:rPr>
+        <w:t>salesrep_id</w:t>
+      </w:r>
+      <w:proofErr w:type="spellEnd"/>
+      <w:r>
+        <w:rPr>
+          <w:rFonts w:ascii="Calibri" w:hAnsi="Calibri" w:cs="Calibri"/>
+          <w:sz w:val="22"/>
+          <w:szCs w:val="22"/>
+          <w:lang w:val="en-US"/>
+        </w:rPr>
+        <w:t xml:space="preserve">, </w:t>
+      </w:r>
+      <w:proofErr w:type="spellStart"/>
+      <w:r>
+        <w:rPr>
+          <w:rFonts w:ascii="Calibri" w:hAnsi="Calibri" w:cs="Calibri"/>
+          <w:sz w:val="22"/>
+          <w:szCs w:val="22"/>
+          <w:lang w:val="en-US"/>
+        </w:rPr>
+        <w:t>drug_code</w:t>
+      </w:r>
+      <w:proofErr w:type="spellEnd"/>
+      <w:r>
+        <w:rPr>
+          <w:rFonts w:ascii="Calibri" w:hAnsi="Calibri" w:cs="Calibri"/>
+          <w:sz w:val="22"/>
+          <w:szCs w:val="22"/>
+          <w:lang w:val="en-US"/>
+        </w:rPr>
+        <w:t xml:space="preserve">)  </w:t>
+      </w:r>
+    </w:p>
+    <w:p>
+      <w:pPr>
+        <w:spacing w:after="0" w:line="240" w:lineRule="auto"/>
+        <w:rPr>
+          <w:rFonts w:ascii="Calibri" w:hAnsi="Calibri" w:cs="Calibri"/>
+          <w:sz w:val="22"/>
+          <w:szCs w:val="22"/>
+          <w:lang w:val="en-US"/>
+        </w:rPr>
+      </w:pPr>
+    </w:p>
+    <w:p>
+      <w:pPr>
+        <w:spacing w:after="0" w:line="240" w:lineRule="auto"/>
+        <w:rPr>
+          <w:rFonts w:ascii="Calibri" w:hAnsi="Calibri" w:cs="Calibri"/>
+          <w:b/>
+          <w:bCs/>
+          <w:sz w:val="22"/>
+          <w:szCs w:val="22"/>
+          <w:lang w:val="en-US"/>
+        </w:rPr>
+      </w:pPr>
+      <w:r>
+        <w:rPr>
+          <w:rFonts w:ascii="Calibri" w:hAnsi="Calibri" w:cs="Calibri"/>
+          <w:b/>
+          <w:bCs/>
+          <w:sz w:val="22"/>
+          <w:szCs w:val="22"/>
+          <w:lang w:val="en-US"/>
+        </w:rPr>
+        <w:t xml:space="preserve">Partial Dependencies:  </w:t>
+      </w:r>
+    </w:p>
+    <w:p>
+      <w:pPr>
+        <w:spacing w:after="0" w:line="240" w:lineRule="auto"/>
+        <w:rPr>
+          <w:rFonts w:ascii="Calibri" w:hAnsi="Calibri" w:cs="Calibri"/>
+          <w:sz w:val="22"/>
+          <w:szCs w:val="22"/>
+          <w:lang w:val="en-US"/>
+        </w:rPr>
+      </w:pPr>
+      <w:proofErr w:type="spellStart"/>
+      <w:r>
+        <w:rPr>
+          <w:rFonts w:ascii="Calibri" w:hAnsi="Calibri" w:cs="Calibri"/>
+          <w:sz w:val="22"/>
+          <w:szCs w:val="22"/>
+          <w:lang w:val="en-US"/>
+        </w:rPr>
+        <w:t>branch_id</w:t>
+      </w:r>
+      <w:proofErr w:type="spellEnd"/>
+      <w:r>
+        <w:rPr>
+          <w:rFonts w:ascii="Calibri" w:hAnsi="Calibri" w:cs="Calibri"/>
+          <w:sz w:val="22"/>
+          <w:szCs w:val="22"/>
+          <w:lang w:val="en-US"/>
+        </w:rPr>
+        <w:t xml:space="preserve"> → </w:t>
+      </w:r>
+      <w:proofErr w:type="spellStart"/>
+      <w:r>
+        <w:rPr>
+          <w:rFonts w:ascii="Calibri" w:hAnsi="Calibri" w:cs="Calibri"/>
+          <w:sz w:val="22"/>
+          <w:szCs w:val="22"/>
+          <w:lang w:val="en-US"/>
+        </w:rPr>
+        <w:t>branch_name</w:t>
+      </w:r>
+      <w:proofErr w:type="spellEnd"/>
+      <w:r>
+        <w:rPr>
+          <w:rFonts w:ascii="Calibri" w:hAnsi="Calibri" w:cs="Calibri"/>
+          <w:sz w:val="22"/>
+          <w:szCs w:val="22"/>
+          <w:lang w:val="en-US"/>
+        </w:rPr>
+        <w:t xml:space="preserve">  </w:t>
+      </w:r>
+    </w:p>
+    <w:p>
+      <w:pPr>
+        <w:spacing w:after="0" w:line="240" w:lineRule="auto"/>
+        <w:rPr>
+          <w:rFonts w:ascii="Calibri" w:hAnsi="Calibri" w:cs="Calibri"/>
+          <w:sz w:val="22"/>
+          <w:szCs w:val="22"/>
+          <w:lang w:val="en-US"/>
+        </w:rPr>
+      </w:pPr>
+      <w:proofErr w:type="spellStart"/>
+      <w:r>
+        <w:rPr>
+          <w:rFonts w:ascii="Calibri" w:hAnsi="Calibri" w:cs="Calibri"/>
+          <w:sz w:val="22"/>
+          <w:szCs w:val="22"/>
+          <w:lang w:val="en-US"/>
+        </w:rPr>
+        <w:t>drug_code</w:t>
+      </w:r>
+      <w:proofErr w:type="spellEnd"/>
+      <w:r>
+        <w:rPr>
+          <w:rFonts w:ascii="Calibri" w:hAnsi="Calibri" w:cs="Calibri"/>
+          <w:sz w:val="22"/>
+          <w:szCs w:val="22"/>
+          <w:lang w:val="en-US"/>
+        </w:rPr>
+        <w:t xml:space="preserve"> → </w:t>
+      </w:r>
+      <w:proofErr w:type="spellStart"/>
+      <w:r>
+        <w:rPr>
+          <w:rFonts w:ascii="Calibri" w:hAnsi="Calibri" w:cs="Calibri"/>
+          <w:sz w:val="22"/>
+          <w:szCs w:val="22"/>
+          <w:lang w:val="en-US"/>
+        </w:rPr>
+        <w:t>drug_name</w:t>
+      </w:r>
+      <w:proofErr w:type="spellEnd"/>
+      <w:r>
+        <w:rPr>
+          <w:rFonts w:ascii="Calibri" w:hAnsi="Calibri" w:cs="Calibri"/>
+          <w:sz w:val="22"/>
+          <w:szCs w:val="22"/>
+          <w:lang w:val="en-US"/>
+        </w:rPr>
+        <w:t xml:space="preserve">  </w:t>
+      </w:r>
+    </w:p>
+    <w:p>
+      <w:pPr>
+        <w:spacing w:after="0" w:line="240" w:lineRule="auto"/>
+        <w:rPr>
+          <w:rFonts w:ascii="Calibri" w:hAnsi="Calibri" w:cs="Calibri"/>
+          <w:sz w:val="22"/>
+          <w:szCs w:val="22"/>
+          <w:lang w:val="en-US"/>
+        </w:rPr>
+      </w:pPr>
+    </w:p>
+    <w:p>
+      <w:pPr>
+        <w:spacing w:after="0" w:line="240" w:lineRule="auto"/>
+        <w:rPr>
+          <w:rFonts w:ascii="Calibri" w:hAnsi="Calibri" w:cs="Calibri"/>
+          <w:sz w:val="22"/>
+          <w:szCs w:val="22"/>
+          <w:lang w:val="en-US"/>
+        </w:rPr>
+      </w:pPr>
+    </w:p>
+    <w:p>
+      <w:pPr>
+        <w:spacing w:after="0" w:line="240" w:lineRule="auto"/>
+        <w:rPr>
+          <w:rFonts w:ascii="Calibri" w:hAnsi="Calibri" w:cs="Calibri"/>
+          <w:b/>
+          <w:bCs/>
+          <w:sz w:val="22"/>
+          <w:szCs w:val="22"/>
+          <w:lang w:val="en-US"/>
+        </w:rPr>
+      </w:pPr>
+      <w:r>
+        <w:rPr>
+          <w:rFonts w:ascii="Calibri" w:hAnsi="Calibri" w:cs="Calibri"/>
+          <w:b/>
+          <w:bCs/>
+          <w:sz w:val="22"/>
+          <w:szCs w:val="22"/>
+          <w:lang w:val="en-US"/>
+        </w:rPr>
+        <w:t xml:space="preserve">2NF  </w:t>
+      </w:r>
+    </w:p>
+    <w:p>
+      <w:pPr>
+        <w:spacing w:after="0" w:line="240" w:lineRule="auto"/>
+        <w:rPr>
+          <w:rFonts w:ascii="Calibri" w:hAnsi="Calibri" w:cs="Calibri"/>
+          <w:sz w:val="22"/>
+          <w:szCs w:val="22"/>
+          <w:lang w:val="en-US"/>
+        </w:rPr>
+      </w:pPr>
+      <w:proofErr w:type="gramStart"/>
+      <w:r>
+        <w:rPr>
+          <w:rFonts w:ascii="Calibri" w:hAnsi="Calibri" w:cs="Calibri"/>
+          <w:sz w:val="22"/>
+          <w:szCs w:val="22"/>
+          <w:lang w:val="en-US"/>
+        </w:rPr>
+        <w:t>SALESREP(</w:t>
+      </w:r>
+      <w:proofErr w:type="spellStart"/>
+      <w:proofErr w:type="gramEnd"/>
+      <w:r>
+        <w:rPr>
+          <w:rFonts w:ascii="Calibri" w:hAnsi="Calibri" w:cs="Calibri"/>
+          <w:sz w:val="22"/>
+          <w:szCs w:val="22"/>
+          <w:lang w:val="en-US"/>
+        </w:rPr>
+        <w:t>salesrep_id</w:t>
+      </w:r>
+      <w:proofErr w:type="spellEnd"/>
+      <w:r>
+        <w:rPr>
+          <w:rFonts w:ascii="Calibri" w:hAnsi="Calibri" w:cs="Calibri"/>
+          <w:sz w:val="22"/>
+          <w:szCs w:val="22"/>
+          <w:lang w:val="en-US"/>
+        </w:rPr>
+        <w:t xml:space="preserve">, </w:t>
+      </w:r>
+      <w:proofErr w:type="spellStart"/>
+      <w:r>
+        <w:rPr>
+          <w:rFonts w:ascii="Calibri" w:hAnsi="Calibri" w:cs="Calibri"/>
+          <w:sz w:val="22"/>
+          <w:szCs w:val="22"/>
+          <w:lang w:val="en-US"/>
+        </w:rPr>
+        <w:t>salesrep_name</w:t>
+      </w:r>
+      <w:proofErr w:type="spellEnd"/>
+      <w:r>
+        <w:rPr>
+          <w:rFonts w:ascii="Calibri" w:hAnsi="Calibri" w:cs="Calibri"/>
+          <w:sz w:val="22"/>
+          <w:szCs w:val="22"/>
+          <w:lang w:val="en-US"/>
+        </w:rPr>
+        <w:t xml:space="preserve">, </w:t>
+      </w:r>
+      <w:proofErr w:type="spellStart"/>
+      <w:r>
+        <w:rPr>
+          <w:rFonts w:ascii="Calibri" w:hAnsi="Calibri" w:cs="Calibri"/>
+          <w:sz w:val="22"/>
+          <w:szCs w:val="22"/>
+          <w:lang w:val="en-US"/>
+        </w:rPr>
+        <w:t>salesrep_mobile</w:t>
+      </w:r>
+      <w:proofErr w:type="spellEnd"/>
+      <w:r>
+        <w:rPr>
+          <w:rFonts w:ascii="Calibri" w:hAnsi="Calibri" w:cs="Calibri"/>
+          <w:sz w:val="22"/>
+          <w:szCs w:val="22"/>
+          <w:lang w:val="en-US"/>
+        </w:rPr>
+        <w:t xml:space="preserve">, </w:t>
+      </w:r>
+      <w:proofErr w:type="spellStart"/>
+      <w:r>
+        <w:rPr>
+          <w:rFonts w:ascii="Calibri" w:hAnsi="Calibri" w:cs="Calibri"/>
+          <w:sz w:val="22"/>
+          <w:szCs w:val="22"/>
+          <w:lang w:val="en-US"/>
+        </w:rPr>
+        <w:t>branch_id</w:t>
+      </w:r>
+      <w:proofErr w:type="spellEnd"/>
+      <w:r>
+        <w:rPr>
+          <w:rFonts w:ascii="Calibri" w:hAnsi="Calibri" w:cs="Calibri"/>
+          <w:sz w:val="22"/>
+          <w:szCs w:val="22"/>
+          <w:lang w:val="en-US"/>
+        </w:rPr>
+        <w:t xml:space="preserve">)  </w:t>
+      </w:r>
+    </w:p>
+    <w:p>
+      <w:pPr>
+        <w:spacing w:after="0" w:line="240" w:lineRule="auto"/>
+        <w:rPr>
+          <w:rFonts w:ascii="Calibri" w:hAnsi="Calibri" w:cs="Calibri"/>
+          <w:sz w:val="22"/>
+          <w:szCs w:val="22"/>
+          <w:lang w:val="en-US"/>
+        </w:rPr>
+      </w:pPr>
+      <w:proofErr w:type="gramStart"/>
+      <w:r>
+        <w:rPr>
+          <w:rFonts w:ascii="Calibri" w:hAnsi="Calibri" w:cs="Calibri"/>
+          <w:sz w:val="22"/>
+          <w:szCs w:val="22"/>
+          <w:lang w:val="en-US"/>
+        </w:rPr>
+        <w:t>BRANCH(</w:t>
+      </w:r>
+      <w:proofErr w:type="spellStart"/>
+      <w:proofErr w:type="gramEnd"/>
+      <w:r>
+        <w:rPr>
+          <w:rFonts w:ascii="Calibri" w:hAnsi="Calibri" w:cs="Calibri"/>
+          <w:sz w:val="22"/>
+          <w:szCs w:val="22"/>
+          <w:lang w:val="en-US"/>
+        </w:rPr>
+        <w:t>branch_id</w:t>
+      </w:r>
+      <w:proofErr w:type="spellEnd"/>
+      <w:r>
+        <w:rPr>
+          <w:rFonts w:ascii="Calibri" w:hAnsi="Calibri" w:cs="Calibri"/>
+          <w:sz w:val="22"/>
+          <w:szCs w:val="22"/>
+          <w:lang w:val="en-US"/>
+        </w:rPr>
+        <w:t xml:space="preserve">, </w:t>
+      </w:r>
+      <w:proofErr w:type="spellStart"/>
+      <w:r>
+        <w:rPr>
+          <w:rFonts w:ascii="Calibri" w:hAnsi="Calibri" w:cs="Calibri"/>
+          <w:sz w:val="22"/>
+          <w:szCs w:val="22"/>
+          <w:lang w:val="en-US"/>
+        </w:rPr>
+        <w:t>branch_name</w:t>
+      </w:r>
+      <w:proofErr w:type="spellEnd"/>
+      <w:r>
+        <w:rPr>
+          <w:rFonts w:ascii="Calibri" w:hAnsi="Calibri" w:cs="Calibri"/>
+          <w:sz w:val="22"/>
+          <w:szCs w:val="22"/>
+          <w:lang w:val="en-US"/>
+        </w:rPr>
+        <w:t xml:space="preserve">)  </w:t>
+      </w:r>
+    </w:p>
+    <w:p>
+      <w:pPr>
+        <w:spacing w:after="0" w:line="240" w:lineRule="auto"/>
+        <w:rPr>
+          <w:rFonts w:ascii="Calibri" w:hAnsi="Calibri" w:cs="Calibri"/>
+          <w:sz w:val="22"/>
+          <w:szCs w:val="22"/>
+          <w:lang w:val="en-US"/>
+        </w:rPr>
+      </w:pPr>
+      <w:r>
+        <w:rPr>
+          <w:rFonts w:ascii="Calibri" w:hAnsi="Calibri" w:cs="Calibri"/>
+          <w:sz w:val="22"/>
+          <w:szCs w:val="22"/>
+          <w:lang w:val="en-US"/>
+        </w:rPr>
+        <w:t>SALESREP_</w:t>
+      </w:r>
+      <w:proofErr w:type="gramStart"/>
+      <w:r>
+        <w:rPr>
+          <w:rFonts w:ascii="Calibri" w:hAnsi="Calibri" w:cs="Calibri"/>
+          <w:sz w:val="22"/>
+          <w:szCs w:val="22"/>
+          <w:lang w:val="en-US"/>
+        </w:rPr>
+        <w:t>DRUG(</w:t>
+      </w:r>
+      <w:proofErr w:type="spellStart"/>
+      <w:proofErr w:type="gramEnd"/>
+      <w:r>
+        <w:rPr>
+          <w:rFonts w:ascii="Calibri" w:hAnsi="Calibri" w:cs="Calibri"/>
+          <w:sz w:val="22"/>
+          <w:szCs w:val="22"/>
+          <w:lang w:val="en-US"/>
+        </w:rPr>
+        <w:t>salesrep_id</w:t>
+      </w:r>
+      <w:proofErr w:type="spellEnd"/>
+      <w:r>
+        <w:rPr>
+          <w:rFonts w:ascii="Calibri" w:hAnsi="Calibri" w:cs="Calibri"/>
+          <w:sz w:val="22"/>
+          <w:szCs w:val="22"/>
+          <w:lang w:val="en-US"/>
+        </w:rPr>
+        <w:t xml:space="preserve">, </w:t>
+      </w:r>
+      <w:proofErr w:type="spellStart"/>
+      <w:r>
+        <w:rPr>
+          <w:rFonts w:ascii="Calibri" w:hAnsi="Calibri" w:cs="Calibri"/>
+          <w:sz w:val="22"/>
+          <w:szCs w:val="22"/>
+          <w:lang w:val="en-US"/>
+        </w:rPr>
+        <w:t>drug_code</w:t>
+      </w:r>
+      <w:proofErr w:type="spellEnd"/>
+      <w:r>
+        <w:rPr>
+          <w:rFonts w:ascii="Calibri" w:hAnsi="Calibri" w:cs="Calibri"/>
+          <w:sz w:val="22"/>
+          <w:szCs w:val="22"/>
+          <w:lang w:val="en-US"/>
+        </w:rPr>
+        <w:t xml:space="preserve">, </w:t>
+      </w:r>
+      <w:proofErr w:type="spellStart"/>
+      <w:r>
+        <w:rPr>
+          <w:rFonts w:ascii="Calibri" w:hAnsi="Calibri" w:cs="Calibri"/>
+          <w:sz w:val="22"/>
+          <w:szCs w:val="22"/>
+          <w:lang w:val="en-US"/>
+        </w:rPr>
+        <w:t>date_assigned</w:t>
+      </w:r>
+      <w:proofErr w:type="spellEnd"/>
+      <w:r>
+        <w:rPr>
+          <w:rFonts w:ascii="Calibri" w:hAnsi="Calibri" w:cs="Calibri"/>
+          <w:sz w:val="22"/>
+          <w:szCs w:val="22"/>
+          <w:lang w:val="en-US"/>
+        </w:rPr>
+        <w:t xml:space="preserve">)  </w:t>
+      </w:r>
+    </w:p>
+    <w:p>
+      <w:pPr>
+        <w:spacing w:after="0" w:line="240" w:lineRule="auto"/>
+        <w:rPr>
+          <w:rFonts w:ascii="Calibri" w:hAnsi="Calibri" w:cs="Calibri"/>
+          <w:sz w:val="22"/>
+          <w:szCs w:val="22"/>
+          <w:lang w:val="en-US"/>
+        </w:rPr>
+      </w:pPr>
+      <w:proofErr w:type="gramStart"/>
+      <w:r>
+        <w:rPr>
+          <w:rFonts w:ascii="Calibri" w:hAnsi="Calibri" w:cs="Calibri"/>
+          <w:sz w:val="22"/>
+          <w:szCs w:val="22"/>
+          <w:lang w:val="en-US"/>
+        </w:rPr>
+        <w:t>DRUG(</w:t>
+      </w:r>
+      <w:proofErr w:type="spellStart"/>
+      <w:proofErr w:type="gramEnd"/>
+      <w:r>
+        <w:rPr>
+          <w:rFonts w:ascii="Calibri" w:hAnsi="Calibri" w:cs="Calibri"/>
+          <w:sz w:val="22"/>
+          <w:szCs w:val="22"/>
+          <w:lang w:val="en-US"/>
+        </w:rPr>
+        <w:t>drug_code</w:t>
+      </w:r>
+      <w:proofErr w:type="spellEnd"/>
+      <w:r>
+        <w:rPr>
+          <w:rFonts w:ascii="Calibri" w:hAnsi="Calibri" w:cs="Calibri"/>
+          <w:sz w:val="22"/>
+          <w:szCs w:val="22"/>
+          <w:lang w:val="en-US"/>
+        </w:rPr>
+        <w:t xml:space="preserve">, </w:t>
+      </w:r>
+      <w:proofErr w:type="spellStart"/>
+      <w:r>
+        <w:rPr>
+          <w:rFonts w:ascii="Calibri" w:hAnsi="Calibri" w:cs="Calibri"/>
+          <w:sz w:val="22"/>
+          <w:szCs w:val="22"/>
+          <w:lang w:val="en-US"/>
+        </w:rPr>
+        <w:t>drug_name</w:t>
+      </w:r>
+      <w:proofErr w:type="spellEnd"/>
+      <w:r>
+        <w:rPr>
+          <w:rFonts w:ascii="Calibri" w:hAnsi="Calibri" w:cs="Calibri"/>
+          <w:sz w:val="22"/>
+          <w:szCs w:val="22"/>
+          <w:lang w:val="en-US"/>
+        </w:rPr>
+        <w:t xml:space="preserve">)  </w:t>
+      </w:r>
+    </w:p>
+    <w:p>
+      <w:pPr>
+        <w:spacing w:after="0" w:line="240" w:lineRule="auto"/>
+        <w:rPr>
+          <w:rFonts w:ascii="Calibri" w:hAnsi="Calibri" w:cs="Calibri"/>
+          <w:sz w:val="22"/>
+          <w:szCs w:val="22"/>
+          <w:lang w:val="en-US"/>
+        </w:rPr>
+      </w:pPr>
+    </w:p>
+    <w:p>
+      <w:pPr>
+        <w:spacing w:after="0" w:line="240" w:lineRule="auto"/>
+        <w:rPr>
+          <w:rFonts w:ascii="Calibri" w:hAnsi="Calibri" w:cs="Calibri"/>
+          <w:sz w:val="22"/>
+          <w:szCs w:val="22"/>
+          <w:lang w:val="en-US"/>
+        </w:rPr>
+      </w:pPr>
+    </w:p>
+    <w:p>
+      <w:pPr>
+        <w:spacing w:after="0" w:line="240" w:lineRule="auto"/>
+        <w:rPr>
+          <w:rFonts w:ascii="Calibri" w:hAnsi="Calibri" w:cs="Calibri"/>
+          <w:b/>
+          <w:bCs/>
+          <w:sz w:val="22"/>
+          <w:szCs w:val="22"/>
+          <w:lang w:val="en-US"/>
+        </w:rPr>
+      </w:pPr>
+      <w:r>
+        <w:rPr>
+          <w:rFonts w:ascii="Calibri" w:hAnsi="Calibri" w:cs="Calibri"/>
+          <w:b/>
+          <w:bCs/>
+          <w:sz w:val="22"/>
+          <w:szCs w:val="22"/>
+          <w:lang w:val="en-US"/>
+        </w:rPr>
+        <w:t xml:space="preserve">3NF  </w:t>
+      </w:r>
+    </w:p>
+    <w:p>
+      <w:pPr>
+        <w:spacing w:after="0" w:line="240" w:lineRule="auto"/>
+        <w:rPr>
+          <w:rFonts w:ascii="Calibri" w:hAnsi="Calibri" w:cs="Calibri"/>
+          <w:sz w:val="22"/>
+          <w:szCs w:val="22"/>
+          <w:lang w:val="en-US"/>
+        </w:rPr>
+      </w:pPr>
+      <w:r>
+        <w:rPr>
+          <w:rFonts w:ascii="Calibri" w:hAnsi="Calibri" w:cs="Calibri"/>
+          <w:sz w:val="22"/>
+          <w:szCs w:val="22"/>
+          <w:lang w:val="en-US"/>
+        </w:rPr>
+        <w:t>(No transitive dependencies)</w:t>
+      </w:r>
+    </w:p>
+    <w:p>
+      <w:pPr>
+        <w:spacing w:after="0" w:line="240" w:lineRule="auto"/>
+        <w:rPr>
+          <w:rFonts w:ascii="Calibri" w:hAnsi="Calibri" w:cs="Calibri"/>
+          <w:sz w:val="22"/>
+          <w:szCs w:val="22"/>
+          <w:lang w:val="en-US"/>
+        </w:rPr>
+      </w:pPr>
+    </w:p>
+    <w:p>
+      <w:pPr>
+        <w:spacing w:after="0" w:line="240" w:lineRule="auto"/>
+        <w:rPr>
+          <w:rFonts w:ascii="Calibri" w:hAnsi="Calibri" w:cs="Calibri"/>
+          <w:sz w:val="22"/>
+          <w:szCs w:val="22"/>
+          <w:lang w:val="en-US"/>
+        </w:rPr>
+      </w:pPr>
+      <w:proofErr w:type="gramStart"/>
+      <w:r>
+        <w:rPr>
+          <w:rFonts w:ascii="Calibri" w:hAnsi="Calibri" w:cs="Calibri"/>
+          <w:sz w:val="22"/>
+          <w:szCs w:val="22"/>
+          <w:lang w:val="en-US"/>
+        </w:rPr>
+        <w:t>SALESREP(</w:t>
+      </w:r>
+      <w:proofErr w:type="spellStart"/>
+      <w:proofErr w:type="gramEnd"/>
+      <w:r>
+        <w:rPr>
+          <w:rFonts w:ascii="Calibri" w:hAnsi="Calibri" w:cs="Calibri"/>
+          <w:sz w:val="22"/>
+          <w:szCs w:val="22"/>
+          <w:lang w:val="en-US"/>
+        </w:rPr>
+        <w:t>salesrep_id</w:t>
+      </w:r>
+      <w:proofErr w:type="spellEnd"/>
+      <w:r>
+        <w:rPr>
+          <w:rFonts w:ascii="Calibri" w:hAnsi="Calibri" w:cs="Calibri"/>
+          <w:sz w:val="22"/>
+          <w:szCs w:val="22"/>
+          <w:lang w:val="en-US"/>
+        </w:rPr>
+        <w:t xml:space="preserve">, </w:t>
+      </w:r>
+      <w:proofErr w:type="spellStart"/>
+      <w:r>
+        <w:rPr>
+          <w:rFonts w:ascii="Calibri" w:hAnsi="Calibri" w:cs="Calibri"/>
+          <w:sz w:val="22"/>
+          <w:szCs w:val="22"/>
+          <w:lang w:val="en-US"/>
+        </w:rPr>
+        <w:t>salesrep_name</w:t>
+      </w:r>
+      <w:proofErr w:type="spellEnd"/>
+      <w:r>
+        <w:rPr>
+          <w:rFonts w:ascii="Calibri" w:hAnsi="Calibri" w:cs="Calibri"/>
+          <w:sz w:val="22"/>
+          <w:szCs w:val="22"/>
+          <w:lang w:val="en-US"/>
+        </w:rPr>
+        <w:t xml:space="preserve">, </w:t>
+      </w:r>
+      <w:proofErr w:type="spellStart"/>
+      <w:r>
+        <w:rPr>
+          <w:rFonts w:ascii="Calibri" w:hAnsi="Calibri" w:cs="Calibri"/>
+          <w:sz w:val="22"/>
+          <w:szCs w:val="22"/>
+          <w:lang w:val="en-US"/>
+        </w:rPr>
+        <w:t>salesrep_mobile</w:t>
+      </w:r>
+      <w:proofErr w:type="spellEnd"/>
+      <w:r>
+        <w:rPr>
+          <w:rFonts w:ascii="Calibri" w:hAnsi="Calibri" w:cs="Calibri"/>
+          <w:sz w:val="22"/>
+          <w:szCs w:val="22"/>
+          <w:lang w:val="en-US"/>
+        </w:rPr>
+        <w:t xml:space="preserve">, </w:t>
+      </w:r>
+      <w:proofErr w:type="spellStart"/>
+      <w:r>
+        <w:rPr>
+          <w:rFonts w:ascii="Calibri" w:hAnsi="Calibri" w:cs="Calibri"/>
+          <w:sz w:val="22"/>
+          <w:szCs w:val="22"/>
+          <w:lang w:val="en-US"/>
+        </w:rPr>
+        <w:t>branch_id</w:t>
+      </w:r>
+      <w:proofErr w:type="spellEnd"/>
+      <w:r>
+        <w:rPr>
+          <w:rFonts w:ascii="Calibri" w:hAnsi="Calibri" w:cs="Calibri"/>
+          <w:sz w:val="22"/>
+          <w:szCs w:val="22"/>
+          <w:lang w:val="en-US"/>
+        </w:rPr>
+        <w:t xml:space="preserve">)  </w:t>
+      </w:r>
+    </w:p>
+    <w:p>
+      <w:pPr>
+        <w:spacing w:after="0" w:line="240" w:lineRule="auto"/>
+        <w:rPr>
+          <w:rFonts w:ascii="Calibri" w:hAnsi="Calibri" w:cs="Calibri"/>
+          <w:sz w:val="22"/>
+          <w:szCs w:val="22"/>
+          <w:lang w:val="en-US"/>
+        </w:rPr>
+      </w:pPr>
+      <w:proofErr w:type="gramStart"/>
+      <w:r>
+        <w:rPr>
+          <w:rFonts w:ascii="Calibri" w:hAnsi="Calibri" w:cs="Calibri"/>
+          <w:sz w:val="22"/>
+          <w:szCs w:val="22"/>
+          <w:lang w:val="en-US"/>
+        </w:rPr>
+        <w:t>BRANCH(</w:t>
+      </w:r>
+      <w:proofErr w:type="spellStart"/>
+      <w:proofErr w:type="gramEnd"/>
+      <w:r>
+        <w:rPr>
+          <w:rFonts w:ascii="Calibri" w:hAnsi="Calibri" w:cs="Calibri"/>
+          <w:sz w:val="22"/>
+          <w:szCs w:val="22"/>
+          <w:lang w:val="en-US"/>
+        </w:rPr>
+        <w:t>branch_id</w:t>
+      </w:r>
+      <w:proofErr w:type="spellEnd"/>
+      <w:r>
+        <w:rPr>
+          <w:rFonts w:ascii="Calibri" w:hAnsi="Calibri" w:cs="Calibri"/>
+          <w:sz w:val="22"/>
+          <w:szCs w:val="22"/>
+          <w:lang w:val="en-US"/>
+        </w:rPr>
+        <w:t xml:space="preserve">, </w:t>
+      </w:r>
+      <w:proofErr w:type="spellStart"/>
+      <w:r>
+        <w:rPr>
+          <w:rFonts w:ascii="Calibri" w:hAnsi="Calibri" w:cs="Calibri"/>
+          <w:sz w:val="22"/>
+          <w:szCs w:val="22"/>
+          <w:lang w:val="en-US"/>
+        </w:rPr>
+        <w:t>branch_name</w:t>
+      </w:r>
+      <w:proofErr w:type="spellEnd"/>
+      <w:r>
+        <w:rPr>
+          <w:rFonts w:ascii="Calibri" w:hAnsi="Calibri" w:cs="Calibri"/>
+          <w:sz w:val="22"/>
+          <w:szCs w:val="22"/>
+          <w:lang w:val="en-US"/>
+        </w:rPr>
+        <w:t xml:space="preserve">)  </w:t>
+      </w:r>
+    </w:p>
+    <w:p>
+      <w:pPr>
+        <w:spacing w:after="0" w:line="240" w:lineRule="auto"/>
+        <w:rPr>
+          <w:rFonts w:ascii="Calibri" w:hAnsi="Calibri" w:cs="Calibri"/>
+          <w:sz w:val="22"/>
+          <w:szCs w:val="22"/>
+          <w:lang w:val="en-US"/>
+        </w:rPr>
+      </w:pPr>
+      <w:proofErr w:type="gramStart"/>
+      <w:r>
+        <w:rPr>
+          <w:rFonts w:ascii="Calibri" w:hAnsi="Calibri" w:cs="Calibri"/>
+          <w:sz w:val="22"/>
+          <w:szCs w:val="22"/>
+          <w:lang w:val="en-US"/>
+        </w:rPr>
+        <w:t>DRUG(</w:t>
+      </w:r>
+      <w:proofErr w:type="spellStart"/>
+      <w:proofErr w:type="gramEnd"/>
+      <w:r>
+        <w:rPr>
+          <w:rFonts w:ascii="Calibri" w:hAnsi="Calibri" w:cs="Calibri"/>
+          <w:sz w:val="22"/>
+          <w:szCs w:val="22"/>
+          <w:lang w:val="en-US"/>
+        </w:rPr>
+        <w:t>drug_code</w:t>
+      </w:r>
+      <w:proofErr w:type="spellEnd"/>
+      <w:r>
+        <w:rPr>
+          <w:rFonts w:ascii="Calibri" w:hAnsi="Calibri" w:cs="Calibri"/>
+          <w:sz w:val="22"/>
+          <w:szCs w:val="22"/>
+          <w:lang w:val="en-US"/>
+        </w:rPr>
+        <w:t xml:space="preserve">, </w:t>
+      </w:r>
+      <w:proofErr w:type="spellStart"/>
+      <w:r>
+        <w:rPr>
+          <w:rFonts w:ascii="Calibri" w:hAnsi="Calibri" w:cs="Calibri"/>
+          <w:sz w:val="22"/>
+          <w:szCs w:val="22"/>
+          <w:lang w:val="en-US"/>
+        </w:rPr>
+        <w:t>drug_name</w:t>
+      </w:r>
+      <w:proofErr w:type="spellEnd"/>
+      <w:r>
+        <w:rPr>
+          <w:rFonts w:ascii="Calibri" w:hAnsi="Calibri" w:cs="Calibri"/>
+          <w:sz w:val="22"/>
+          <w:szCs w:val="22"/>
+          <w:lang w:val="en-US"/>
+        </w:rPr>
+        <w:t xml:space="preserve">)  </w:t>
+      </w:r>
+    </w:p>
+    <w:p>
+      <w:pPr>
+        <w:spacing w:after="0" w:line="240" w:lineRule="auto"/>
+        <w:rPr>
+          <w:rFonts w:ascii="Calibri" w:hAnsi="Calibri" w:cs="Calibri"/>
+          <w:sz w:val="22"/>
+          <w:szCs w:val="22"/>
+          <w:lang w:val="en-US"/>
+        </w:rPr>
+      </w:pPr>
+      <w:r>
+        <w:rPr>
+          <w:rFonts w:ascii="Calibri" w:hAnsi="Calibri" w:cs="Calibri"/>
+          <w:sz w:val="22"/>
+          <w:szCs w:val="22"/>
+          <w:lang w:val="en-US"/>
+        </w:rPr>
+        <w:t>SALESREP_</w:t>
+      </w:r>
+      <w:proofErr w:type="gramStart"/>
+      <w:r>
+        <w:rPr>
+          <w:rFonts w:ascii="Calibri" w:hAnsi="Calibri" w:cs="Calibri"/>
+          <w:sz w:val="22"/>
+          <w:szCs w:val="22"/>
+          <w:lang w:val="en-US"/>
+        </w:rPr>
+        <w:t>DRUG(</w:t>
+      </w:r>
+      <w:proofErr w:type="spellStart"/>
+      <w:proofErr w:type="gramEnd"/>
+      <w:r>
+        <w:rPr>
+          <w:rFonts w:ascii="Calibri" w:hAnsi="Calibri" w:cs="Calibri"/>
+          <w:sz w:val="22"/>
+          <w:szCs w:val="22"/>
+          <w:lang w:val="en-US"/>
+        </w:rPr>
+        <w:t>salesrep_id</w:t>
+      </w:r>
+      <w:proofErr w:type="spellEnd"/>
+      <w:r>
+        <w:rPr>
+          <w:rFonts w:ascii="Calibri" w:hAnsi="Calibri" w:cs="Calibri"/>
+          <w:sz w:val="22"/>
+          <w:szCs w:val="22"/>
+          <w:lang w:val="en-US"/>
+        </w:rPr>
+        <w:t xml:space="preserve">, </w:t>
+      </w:r>
+      <w:proofErr w:type="spellStart"/>
+      <w:r>
+        <w:rPr>
+          <w:rFonts w:ascii="Calibri" w:hAnsi="Calibri" w:cs="Calibri"/>
+          <w:sz w:val="22"/>
+          <w:szCs w:val="22"/>
+          <w:lang w:val="en-US"/>
+        </w:rPr>
+        <w:t>drug_code</w:t>
+      </w:r>
+      <w:proofErr w:type="spellEnd"/>
+      <w:r>
+        <w:rPr>
+          <w:rFonts w:ascii="Calibri" w:hAnsi="Calibri" w:cs="Calibri"/>
+          <w:sz w:val="22"/>
+          <w:szCs w:val="22"/>
+          <w:lang w:val="en-US"/>
+        </w:rPr>
+        <w:t xml:space="preserve">, </w:t>
+      </w:r>
+      <w:proofErr w:type="spellStart"/>
+      <w:r>
+        <w:rPr>
+          <w:rFonts w:ascii="Calibri" w:hAnsi="Calibri" w:cs="Calibri"/>
+          <w:sz w:val="22"/>
+          <w:szCs w:val="22"/>
+          <w:lang w:val="en-US"/>
+        </w:rPr>
+        <w:t>date_assigned</w:t>
+      </w:r>
+      <w:proofErr w:type="spellEnd"/>
+      <w:r>
+        <w:rPr>
+          <w:rFonts w:ascii="Calibri" w:hAnsi="Calibri" w:cs="Calibri"/>
+          <w:sz w:val="22"/>
+          <w:szCs w:val="22"/>
+          <w:lang w:val="en-US"/>
+        </w:rPr>
+        <w:t>)</w:t>
+      </w:r>
+    </w:p>
+    <w:p>
+      <w:pPr>
+        <w:spacing w:after="0" w:line="240" w:lineRule="auto"/>
+        <w:rPr>
+          <w:rFonts w:ascii="Calibri" w:hAnsi="Calibri" w:cs="Calibri"/>
+          <w:sz w:val="22"/>
+          <w:szCs w:val="22"/>
+          <w:lang w:val="en-US"/>
+        </w:rPr>
+      </w:pPr>
+    </w:p>
+    <w:p>
+      <w:pPr>
+        <w:spacing w:after="0" w:line="240" w:lineRule="auto"/>
+        <w:rPr>
+          <w:rFonts w:ascii="Calibri" w:hAnsi="Calibri" w:cs="Calibri"/>
+          <w:sz w:val="22"/>
+          <w:szCs w:val="22"/>
+          <w:lang w:val="en-US"/>
+        </w:rPr>
+      </w:pPr>
+    </w:p>
+    <w:p>
+      <w:pPr>
+        <w:spacing w:after="0" w:line="240" w:lineRule="auto"/>
+        <w:rPr>
+          <w:rFonts w:ascii="Calibri" w:hAnsi="Calibri" w:cs="Calibri"/>
+          <w:b/>
+          <w:bCs/>
+          <w:sz w:val="22"/>
+          <w:szCs w:val="22"/>
+          <w:lang w:val="en-US"/>
+        </w:rPr>
+      </w:pPr>
+    </w:p>
+    <w:p>
+      <w:pPr>
+        <w:spacing w:after="0" w:line="240" w:lineRule="auto"/>
+        <w:rPr>
+          <w:rFonts w:ascii="Calibri" w:hAnsi="Calibri" w:cs="Calibri"/>
+          <w:sz w:val="22"/>
+          <w:szCs w:val="22"/>
+          <w:lang w:val="en-US"/>
+        </w:rPr>
+      </w:pPr>
     </w:p>
     <w:sectPr>
       <w:pgSz w:w="11906" w:h="16838"/>
@@ -81,6 +1672,315 @@
     </w:sectPr>
   </w:body>
 </w:document>
+</file>
+
+<file path=word/numbering.xml><?xml version="1.0" encoding="utf-8"?>
+<w:numbering xmlns:wpc="http://schemas.microsoft.com/office/word/2010/wordprocessingCanvas" xmlns:cx="http://schemas.microsoft.com/office/drawing/2014/chartex" xmlns:cx1="http://schemas.microsoft.com/office/drawing/2015/9/8/chartex" xmlns:cx2="http://schemas.microsoft.com/office/drawing/2015/10/21/chartex" xmlns:cx3="http://schemas.microsoft.com/office/drawing/2016/5/9/chartex" xmlns:cx4="http://schemas.microsoft.com/office/drawing/2016/5/10/chartex" xmlns:cx5="http://schemas.microsoft.com/office/drawing/2016/5/11/chartex" xmlns:cx6="http://schemas.microsoft.com/office/drawing/2016/5/12/chartex" xmlns:cx7="http://schemas.microsoft.com/office/drawing/2016/5/13/chartex" xmlns:cx8="http://schemas.microsoft.com/office/drawing/2016/5/14/chartex" xmlns:mc="http://schemas.openxmlformats.org/markup-compatibility/2006" xmlns:aink="http://schemas.microsoft.com/office/drawing/2016/ink" xmlns:am3d="http://schemas.microsoft.com/office/drawing/2017/model3d" xmlns:o="urn:schemas-microsoft-com:office:office" xmlns:oel="http://schemas.microsoft.com/office/2019/extlst" xmlns:r="http://schemas.openxmlformats.org/officeDocument/2006/relationships" xmlns:m="http://schemas.openxmlformats.org/officeDocument/2006/math" xmlns:v="urn:schemas-microsoft-com:vml" xmlns:wp14="http://schemas.microsoft.com/office/word/2010/wordprocessingDrawing" xmlns:wp="http://schemas.openxmlformats.org/drawingml/2006/wordprocessingDrawing" xmlns:w10="urn:schemas-microsoft-com:office:word" xmlns:w="http://schemas.openxmlformats.org/wordprocessingml/2006/main" xmlns:w14="http://schemas.microsoft.com/office/word/2010/wordml" xmlns:w15="http://schemas.microsoft.com/office/word/2012/wordml" xmlns:w16cex="http://schemas.microsoft.com/office/word/2018/wordml/cex" xmlns:w16cid="http://schemas.microsoft.com/office/word/2016/wordml/cid" xmlns:w16="http://schemas.microsoft.com/office/word/2018/wordml" xmlns:w16du="http://schemas.microsoft.com/office/word/2023/wordml/word16du" xmlns:w16sdtdh="http://schemas.microsoft.com/office/word/2020/wordml/sdtdatahash" xmlns:w16sdtfl="http://schemas.microsoft.com/office/word/2024/wordml/sdtformatlock" xmlns:w16se="http://schemas.microsoft.com/office/word/2015/wordml/symex" xmlns:wpg="http://schemas.microsoft.com/office/word/2010/wordprocessingGroup" xmlns:wpi="http://schemas.microsoft.com/office/word/2010/wordprocessingInk" xmlns:wne="http://schemas.microsoft.com/office/word/2006/wordml" xmlns:wps="http://schemas.microsoft.com/office/word/2010/wordprocessingShape" mc:Ignorable="w14 w15 w16se w16cid w16 w16cex w16sdtdh w16sdtfl w16du wp14">
+  <w:abstractNum w:abstractNumId="0" w15:restartNumberingAfterBreak="0">
+    <w:nsid w:val="11F3563F"/>
+    <w:multiLevelType w:val="multilevel"/>
+    <w:tmpl w:val="17B60042"/>
+    <w:lvl w:ilvl="0">
+      <w:start w:val="1"/>
+      <w:numFmt w:val="bullet"/>
+      <w:lvlText w:val=""/>
+      <w:lvlJc w:val="left"/>
+      <w:pPr>
+        <w:tabs>
+          <w:tab w:val="num" w:pos="720"/>
+        </w:tabs>
+        <w:ind w:left="720" w:hanging="360"/>
+      </w:pPr>
+      <w:rPr>
+        <w:rFonts w:ascii="Symbol" w:hAnsi="Symbol" w:hint="default"/>
+        <w:sz w:val="20"/>
+      </w:rPr>
+    </w:lvl>
+    <w:lvl w:ilvl="1" w:tentative="1">
+      <w:start w:val="1"/>
+      <w:numFmt w:val="bullet"/>
+      <w:lvlText w:val="o"/>
+      <w:lvlJc w:val="left"/>
+      <w:pPr>
+        <w:tabs>
+          <w:tab w:val="num" w:pos="1440"/>
+        </w:tabs>
+        <w:ind w:left="1440" w:hanging="360"/>
+      </w:pPr>
+      <w:rPr>
+        <w:rFonts w:ascii="Courier New" w:hAnsi="Courier New" w:hint="default"/>
+        <w:sz w:val="20"/>
+      </w:rPr>
+    </w:lvl>
+    <w:lvl w:ilvl="2" w:tentative="1">
+      <w:start w:val="1"/>
+      <w:numFmt w:val="bullet"/>
+      <w:lvlText w:val=""/>
+      <w:lvlJc w:val="left"/>
+      <w:pPr>
+        <w:tabs>
+          <w:tab w:val="num" w:pos="2160"/>
+        </w:tabs>
+        <w:ind w:left="2160" w:hanging="360"/>
+      </w:pPr>
+      <w:rPr>
+        <w:rFonts w:ascii="Wingdings" w:hAnsi="Wingdings" w:hint="default"/>
+        <w:sz w:val="20"/>
+      </w:rPr>
+    </w:lvl>
+    <w:lvl w:ilvl="3" w:tentative="1">
+      <w:start w:val="1"/>
+      <w:numFmt w:val="bullet"/>
+      <w:lvlText w:val=""/>
+      <w:lvlJc w:val="left"/>
+      <w:pPr>
+        <w:tabs>
+          <w:tab w:val="num" w:pos="2880"/>
+        </w:tabs>
+        <w:ind w:left="2880" w:hanging="360"/>
+      </w:pPr>
+      <w:rPr>
+        <w:rFonts w:ascii="Wingdings" w:hAnsi="Wingdings" w:hint="default"/>
+        <w:sz w:val="20"/>
+      </w:rPr>
+    </w:lvl>
+    <w:lvl w:ilvl="4" w:tentative="1">
+      <w:start w:val="1"/>
+      <w:numFmt w:val="bullet"/>
+      <w:lvlText w:val=""/>
+      <w:lvlJc w:val="left"/>
+      <w:pPr>
+        <w:tabs>
+          <w:tab w:val="num" w:pos="3600"/>
+        </w:tabs>
+        <w:ind w:left="3600" w:hanging="360"/>
+      </w:pPr>
+      <w:rPr>
+        <w:rFonts w:ascii="Wingdings" w:hAnsi="Wingdings" w:hint="default"/>
+        <w:sz w:val="20"/>
+      </w:rPr>
+    </w:lvl>
+    <w:lvl w:ilvl="5" w:tentative="1">
+      <w:start w:val="1"/>
+      <w:numFmt w:val="bullet"/>
+      <w:lvlText w:val=""/>
+      <w:lvlJc w:val="left"/>
+      <w:pPr>
+        <w:tabs>
+          <w:tab w:val="num" w:pos="4320"/>
+        </w:tabs>
+        <w:ind w:left="4320" w:hanging="360"/>
+      </w:pPr>
+      <w:rPr>
+        <w:rFonts w:ascii="Wingdings" w:hAnsi="Wingdings" w:hint="default"/>
+        <w:sz w:val="20"/>
+      </w:rPr>
+    </w:lvl>
+    <w:lvl w:ilvl="6" w:tentative="1">
+      <w:start w:val="1"/>
+      <w:numFmt w:val="bullet"/>
+      <w:lvlText w:val=""/>
+      <w:lvlJc w:val="left"/>
+      <w:pPr>
+        <w:tabs>
+          <w:tab w:val="num" w:pos="5040"/>
+        </w:tabs>
+        <w:ind w:left="5040" w:hanging="360"/>
+      </w:pPr>
+      <w:rPr>
+        <w:rFonts w:ascii="Wingdings" w:hAnsi="Wingdings" w:hint="default"/>
+        <w:sz w:val="20"/>
+      </w:rPr>
+    </w:lvl>
+    <w:lvl w:ilvl="7" w:tentative="1">
+      <w:start w:val="1"/>
+      <w:numFmt w:val="bullet"/>
+      <w:lvlText w:val=""/>
+      <w:lvlJc w:val="left"/>
+      <w:pPr>
+        <w:tabs>
+          <w:tab w:val="num" w:pos="5760"/>
+        </w:tabs>
+        <w:ind w:left="5760" w:hanging="360"/>
+      </w:pPr>
+      <w:rPr>
+        <w:rFonts w:ascii="Wingdings" w:hAnsi="Wingdings" w:hint="default"/>
+        <w:sz w:val="20"/>
+      </w:rPr>
+    </w:lvl>
+    <w:lvl w:ilvl="8" w:tentative="1">
+      <w:start w:val="1"/>
+      <w:numFmt w:val="bullet"/>
+      <w:lvlText w:val=""/>
+      <w:lvlJc w:val="left"/>
+      <w:pPr>
+        <w:tabs>
+          <w:tab w:val="num" w:pos="6480"/>
+        </w:tabs>
+        <w:ind w:left="6480" w:hanging="360"/>
+      </w:pPr>
+      <w:rPr>
+        <w:rFonts w:ascii="Wingdings" w:hAnsi="Wingdings" w:hint="default"/>
+        <w:sz w:val="20"/>
+      </w:rPr>
+    </w:lvl>
+  </w:abstractNum>
+  <w:abstractNum w:abstractNumId="1" w15:restartNumberingAfterBreak="0">
+    <w:nsid w:val="45B91BC9"/>
+    <w:multiLevelType w:val="multilevel"/>
+    <w:tmpl w:val="65FA9256"/>
+    <w:lvl w:ilvl="0">
+      <w:start w:val="1"/>
+      <w:numFmt w:val="bullet"/>
+      <w:lvlText w:val=""/>
+      <w:lvlJc w:val="left"/>
+      <w:pPr>
+        <w:tabs>
+          <w:tab w:val="num" w:pos="720"/>
+        </w:tabs>
+        <w:ind w:left="720" w:hanging="360"/>
+      </w:pPr>
+      <w:rPr>
+        <w:rFonts w:ascii="Symbol" w:hAnsi="Symbol" w:hint="default"/>
+        <w:sz w:val="20"/>
+      </w:rPr>
+    </w:lvl>
+    <w:lvl w:ilvl="1" w:tentative="1">
+      <w:start w:val="1"/>
+      <w:numFmt w:val="bullet"/>
+      <w:lvlText w:val="o"/>
+      <w:lvlJc w:val="left"/>
+      <w:pPr>
+        <w:tabs>
+          <w:tab w:val="num" w:pos="1440"/>
+        </w:tabs>
+        <w:ind w:left="1440" w:hanging="360"/>
+      </w:pPr>
+      <w:rPr>
+        <w:rFonts w:ascii="Courier New" w:hAnsi="Courier New" w:hint="default"/>
+        <w:sz w:val="20"/>
+      </w:rPr>
+    </w:lvl>
+    <w:lvl w:ilvl="2" w:tentative="1">
+      <w:start w:val="1"/>
+      <w:numFmt w:val="bullet"/>
+      <w:lvlText w:val=""/>
+      <w:lvlJc w:val="left"/>
+      <w:pPr>
+        <w:tabs>
+          <w:tab w:val="num" w:pos="2160"/>
+        </w:tabs>
+        <w:ind w:left="2160" w:hanging="360"/>
+      </w:pPr>
+      <w:rPr>
+        <w:rFonts w:ascii="Wingdings" w:hAnsi="Wingdings" w:hint="default"/>
+        <w:sz w:val="20"/>
+      </w:rPr>
+    </w:lvl>
+    <w:lvl w:ilvl="3" w:tentative="1">
+      <w:start w:val="1"/>
+      <w:numFmt w:val="bullet"/>
+      <w:lvlText w:val=""/>
+      <w:lvlJc w:val="left"/>
+      <w:pPr>
+        <w:tabs>
+          <w:tab w:val="num" w:pos="2880"/>
+        </w:tabs>
+        <w:ind w:left="2880" w:hanging="360"/>
+      </w:pPr>
+      <w:rPr>
+        <w:rFonts w:ascii="Wingdings" w:hAnsi="Wingdings" w:hint="default"/>
+        <w:sz w:val="20"/>
+      </w:rPr>
+    </w:lvl>
+    <w:lvl w:ilvl="4" w:tentative="1">
+      <w:start w:val="1"/>
+      <w:numFmt w:val="bullet"/>
+      <w:lvlText w:val=""/>
+      <w:lvlJc w:val="left"/>
+      <w:pPr>
+        <w:tabs>
+          <w:tab w:val="num" w:pos="3600"/>
+        </w:tabs>
+        <w:ind w:left="3600" w:hanging="360"/>
+      </w:pPr>
+      <w:rPr>
+        <w:rFonts w:ascii="Wingdings" w:hAnsi="Wingdings" w:hint="default"/>
+        <w:sz w:val="20"/>
+      </w:rPr>
+    </w:lvl>
+    <w:lvl w:ilvl="5" w:tentative="1">
+      <w:start w:val="1"/>
+      <w:numFmt w:val="bullet"/>
+      <w:lvlText w:val=""/>
+      <w:lvlJc w:val="left"/>
+      <w:pPr>
+        <w:tabs>
+          <w:tab w:val="num" w:pos="4320"/>
+        </w:tabs>
+        <w:ind w:left="4320" w:hanging="360"/>
+      </w:pPr>
+      <w:rPr>
+        <w:rFonts w:ascii="Wingdings" w:hAnsi="Wingdings" w:hint="default"/>
+        <w:sz w:val="20"/>
+      </w:rPr>
+    </w:lvl>
+    <w:lvl w:ilvl="6" w:tentative="1">
+      <w:start w:val="1"/>
+      <w:numFmt w:val="bullet"/>
+      <w:lvlText w:val=""/>
+      <w:lvlJc w:val="left"/>
+      <w:pPr>
+        <w:tabs>
+          <w:tab w:val="num" w:pos="5040"/>
+        </w:tabs>
+        <w:ind w:left="5040" w:hanging="360"/>
+      </w:pPr>
+      <w:rPr>
+        <w:rFonts w:ascii="Wingdings" w:hAnsi="Wingdings" w:hint="default"/>
+        <w:sz w:val="20"/>
+      </w:rPr>
+    </w:lvl>
+    <w:lvl w:ilvl="7" w:tentative="1">
+      <w:start w:val="1"/>
+      <w:numFmt w:val="bullet"/>
+      <w:lvlText w:val=""/>
+      <w:lvlJc w:val="left"/>
+      <w:pPr>
+        <w:tabs>
+          <w:tab w:val="num" w:pos="5760"/>
+        </w:tabs>
+        <w:ind w:left="5760" w:hanging="360"/>
+      </w:pPr>
+      <w:rPr>
+        <w:rFonts w:ascii="Wingdings" w:hAnsi="Wingdings" w:hint="default"/>
+        <w:sz w:val="20"/>
+      </w:rPr>
+    </w:lvl>
+    <w:lvl w:ilvl="8" w:tentative="1">
+      <w:start w:val="1"/>
+      <w:numFmt w:val="bullet"/>
+      <w:lvlText w:val=""/>
+      <w:lvlJc w:val="left"/>
+      <w:pPr>
+        <w:tabs>
+          <w:tab w:val="num" w:pos="6480"/>
+        </w:tabs>
+        <w:ind w:left="6480" w:hanging="360"/>
+      </w:pPr>
+      <w:rPr>
+        <w:rFonts w:ascii="Wingdings" w:hAnsi="Wingdings" w:hint="default"/>
+        <w:sz w:val="20"/>
+      </w:rPr>
+    </w:lvl>
+  </w:abstractNum>
+  <w:num w:numId="1" w16cid:durableId="225340044">
+    <w:abstractNumId w:val="0"/>
+  </w:num>
+  <w:num w:numId="2" w16cid:durableId="958028872">
+    <w:abstractNumId w:val="1"/>
+  </w:num>
+</w:numbering>
 </file>
 
 <file path=word/styles.xml><?xml version="1.0" encoding="utf-8"?>
@@ -1000,6 +2900,48 @@
       <w:spacing w:val="5"/>
     </w:rPr>
   </w:style>
+  <w:style w:type="paragraph" w:customStyle="1" w:styleId="p1">
+    <w:name w:val="p1"/>
+    <w:basedOn w:val="Normal"/>
+    <w:rsid w:val="00AD4B71"/>
+    <w:pPr>
+      <w:spacing w:before="100" w:beforeAutospacing="1" w:after="100" w:afterAutospacing="1" w:line="240" w:lineRule="auto"/>
+    </w:pPr>
+    <w:rPr>
+      <w:rFonts w:ascii="Times New Roman" w:eastAsia="Times New Roman" w:hAnsi="Times New Roman" w:cs="Times New Roman"/>
+      <w:kern w:val="0"/>
+      <w:lang w:eastAsia="en-GB"/>
+      <w14:ligatures w14:val="none"/>
+    </w:rPr>
+  </w:style>
+  <w:style w:type="paragraph" w:customStyle="1" w:styleId="p2">
+    <w:name w:val="p2"/>
+    <w:basedOn w:val="Normal"/>
+    <w:rsid w:val="00AD4B71"/>
+    <w:pPr>
+      <w:spacing w:before="100" w:beforeAutospacing="1" w:after="100" w:afterAutospacing="1" w:line="240" w:lineRule="auto"/>
+    </w:pPr>
+    <w:rPr>
+      <w:rFonts w:ascii="Times New Roman" w:eastAsia="Times New Roman" w:hAnsi="Times New Roman" w:cs="Times New Roman"/>
+      <w:kern w:val="0"/>
+      <w:lang w:eastAsia="en-GB"/>
+      <w14:ligatures w14:val="none"/>
+    </w:rPr>
+  </w:style>
+  <w:style w:type="paragraph" w:customStyle="1" w:styleId="p3">
+    <w:name w:val="p3"/>
+    <w:basedOn w:val="Normal"/>
+    <w:rsid w:val="00AD4B71"/>
+    <w:pPr>
+      <w:spacing w:before="100" w:beforeAutospacing="1" w:after="100" w:afterAutospacing="1" w:line="240" w:lineRule="auto"/>
+    </w:pPr>
+    <w:rPr>
+      <w:rFonts w:ascii="Times New Roman" w:eastAsia="Times New Roman" w:hAnsi="Times New Roman" w:cs="Times New Roman"/>
+      <w:kern w:val="0"/>
+      <w:lang w:eastAsia="en-GB"/>
+      <w14:ligatures w14:val="none"/>
+    </w:rPr>
+  </w:style>
 </w:styles>
 </file>
 

</xml_diff>

<commit_message>
added final relations and functional dependencies
</commit_message>
<xml_diff>
--- a/Applied/App04/at4_normalisation.docx
+++ b/Applied/App04/at4_normalisation.docx
@@ -1634,17 +1634,6 @@
         <w:spacing w:after="0" w:line="240" w:lineRule="auto"/>
         <w:rPr>
           <w:rFonts w:ascii="Calibri" w:hAnsi="Calibri" w:cs="Calibri"/>
-          <w:sz w:val="22"/>
-          <w:szCs w:val="22"/>
-          <w:lang w:val="en-US"/>
-        </w:rPr>
-      </w:pPr>
-    </w:p>
-    <w:p>
-      <w:pPr>
-        <w:spacing w:after="0" w:line="240" w:lineRule="auto"/>
-        <w:rPr>
-          <w:rFonts w:ascii="Calibri" w:hAnsi="Calibri" w:cs="Calibri"/>
           <w:b/>
           <w:bCs/>
           <w:sz w:val="22"/>
@@ -1658,11 +1647,651 @@
         <w:spacing w:after="0" w:line="240" w:lineRule="auto"/>
         <w:rPr>
           <w:rFonts w:ascii="Calibri" w:hAnsi="Calibri" w:cs="Calibri"/>
-          <w:sz w:val="22"/>
-          <w:szCs w:val="22"/>
-          <w:lang w:val="en-US"/>
-        </w:rPr>
-      </w:pPr>
+          <w:b/>
+          <w:bCs/>
+          <w:sz w:val="22"/>
+          <w:szCs w:val="22"/>
+          <w:lang w:val="en-US"/>
+        </w:rPr>
+      </w:pPr>
+      <w:r>
+        <w:rPr>
+          <w:rFonts w:ascii="Calibri" w:hAnsi="Calibri" w:cs="Calibri"/>
+          <w:b/>
+          <w:bCs/>
+          <w:sz w:val="22"/>
+          <w:szCs w:val="22"/>
+          <w:lang w:val="en-US"/>
+        </w:rPr>
+        <w:t xml:space="preserve">Final Relations (3NF)  </w:t>
+      </w:r>
+    </w:p>
+    <w:p>
+      <w:pPr>
+        <w:spacing w:after="0" w:line="240" w:lineRule="auto"/>
+        <w:rPr>
+          <w:rFonts w:ascii="Calibri" w:hAnsi="Calibri" w:cs="Calibri"/>
+          <w:sz w:val="22"/>
+          <w:szCs w:val="22"/>
+          <w:lang w:val="en-US"/>
+        </w:rPr>
+      </w:pPr>
+      <w:proofErr w:type="gramStart"/>
+      <w:r>
+        <w:rPr>
+          <w:rFonts w:ascii="Calibri" w:hAnsi="Calibri" w:cs="Calibri"/>
+          <w:sz w:val="22"/>
+          <w:szCs w:val="22"/>
+          <w:lang w:val="en-US"/>
+        </w:rPr>
+        <w:t>SALESREP(</w:t>
+      </w:r>
+      <w:proofErr w:type="spellStart"/>
+      <w:proofErr w:type="gramEnd"/>
+      <w:r>
+        <w:rPr>
+          <w:rFonts w:ascii="Calibri" w:hAnsi="Calibri" w:cs="Calibri"/>
+          <w:sz w:val="22"/>
+          <w:szCs w:val="22"/>
+          <w:lang w:val="en-US"/>
+        </w:rPr>
+        <w:t>salesrep_id</w:t>
+      </w:r>
+      <w:proofErr w:type="spellEnd"/>
+      <w:r>
+        <w:rPr>
+          <w:rFonts w:ascii="Calibri" w:hAnsi="Calibri" w:cs="Calibri"/>
+          <w:sz w:val="22"/>
+          <w:szCs w:val="22"/>
+          <w:lang w:val="en-US"/>
+        </w:rPr>
+        <w:t xml:space="preserve">, </w:t>
+      </w:r>
+      <w:proofErr w:type="spellStart"/>
+      <w:r>
+        <w:rPr>
+          <w:rFonts w:ascii="Calibri" w:hAnsi="Calibri" w:cs="Calibri"/>
+          <w:sz w:val="22"/>
+          <w:szCs w:val="22"/>
+          <w:lang w:val="en-US"/>
+        </w:rPr>
+        <w:t>salesrep_name</w:t>
+      </w:r>
+      <w:proofErr w:type="spellEnd"/>
+      <w:r>
+        <w:rPr>
+          <w:rFonts w:ascii="Calibri" w:hAnsi="Calibri" w:cs="Calibri"/>
+          <w:sz w:val="22"/>
+          <w:szCs w:val="22"/>
+          <w:lang w:val="en-US"/>
+        </w:rPr>
+        <w:t xml:space="preserve">, </w:t>
+      </w:r>
+      <w:proofErr w:type="spellStart"/>
+      <w:r>
+        <w:rPr>
+          <w:rFonts w:ascii="Calibri" w:hAnsi="Calibri" w:cs="Calibri"/>
+          <w:sz w:val="22"/>
+          <w:szCs w:val="22"/>
+          <w:lang w:val="en-US"/>
+        </w:rPr>
+        <w:t>salesrep_mobile</w:t>
+      </w:r>
+      <w:proofErr w:type="spellEnd"/>
+      <w:r>
+        <w:rPr>
+          <w:rFonts w:ascii="Calibri" w:hAnsi="Calibri" w:cs="Calibri"/>
+          <w:sz w:val="22"/>
+          <w:szCs w:val="22"/>
+          <w:lang w:val="en-US"/>
+        </w:rPr>
+        <w:t xml:space="preserve">, </w:t>
+      </w:r>
+      <w:proofErr w:type="spellStart"/>
+      <w:r>
+        <w:rPr>
+          <w:rFonts w:ascii="Calibri" w:hAnsi="Calibri" w:cs="Calibri"/>
+          <w:sz w:val="22"/>
+          <w:szCs w:val="22"/>
+          <w:lang w:val="en-US"/>
+        </w:rPr>
+        <w:t>branch_id</w:t>
+      </w:r>
+      <w:proofErr w:type="spellEnd"/>
+      <w:r>
+        <w:rPr>
+          <w:rFonts w:ascii="Calibri" w:hAnsi="Calibri" w:cs="Calibri"/>
+          <w:sz w:val="22"/>
+          <w:szCs w:val="22"/>
+          <w:lang w:val="en-US"/>
+        </w:rPr>
+        <w:t xml:space="preserve">)  </w:t>
+      </w:r>
+    </w:p>
+    <w:p>
+      <w:pPr>
+        <w:spacing w:after="0" w:line="240" w:lineRule="auto"/>
+        <w:rPr>
+          <w:rFonts w:ascii="Calibri" w:hAnsi="Calibri" w:cs="Calibri"/>
+          <w:sz w:val="22"/>
+          <w:szCs w:val="22"/>
+          <w:lang w:val="en-US"/>
+        </w:rPr>
+      </w:pPr>
+      <w:proofErr w:type="gramStart"/>
+      <w:r>
+        <w:rPr>
+          <w:rFonts w:ascii="Calibri" w:hAnsi="Calibri" w:cs="Calibri"/>
+          <w:sz w:val="22"/>
+          <w:szCs w:val="22"/>
+          <w:lang w:val="en-US"/>
+        </w:rPr>
+        <w:t>BRANCH(</w:t>
+      </w:r>
+      <w:proofErr w:type="spellStart"/>
+      <w:proofErr w:type="gramEnd"/>
+      <w:r>
+        <w:rPr>
+          <w:rFonts w:ascii="Calibri" w:hAnsi="Calibri" w:cs="Calibri"/>
+          <w:sz w:val="22"/>
+          <w:szCs w:val="22"/>
+          <w:lang w:val="en-US"/>
+        </w:rPr>
+        <w:t>branch_id</w:t>
+      </w:r>
+      <w:proofErr w:type="spellEnd"/>
+      <w:r>
+        <w:rPr>
+          <w:rFonts w:ascii="Calibri" w:hAnsi="Calibri" w:cs="Calibri"/>
+          <w:sz w:val="22"/>
+          <w:szCs w:val="22"/>
+          <w:lang w:val="en-US"/>
+        </w:rPr>
+        <w:t xml:space="preserve">, </w:t>
+      </w:r>
+      <w:proofErr w:type="spellStart"/>
+      <w:r>
+        <w:rPr>
+          <w:rFonts w:ascii="Calibri" w:hAnsi="Calibri" w:cs="Calibri"/>
+          <w:sz w:val="22"/>
+          <w:szCs w:val="22"/>
+          <w:lang w:val="en-US"/>
+        </w:rPr>
+        <w:t>branch_name</w:t>
+      </w:r>
+      <w:proofErr w:type="spellEnd"/>
+      <w:r>
+        <w:rPr>
+          <w:rFonts w:ascii="Calibri" w:hAnsi="Calibri" w:cs="Calibri"/>
+          <w:sz w:val="22"/>
+          <w:szCs w:val="22"/>
+          <w:lang w:val="en-US"/>
+        </w:rPr>
+        <w:t xml:space="preserve">)  </w:t>
+      </w:r>
+    </w:p>
+    <w:p>
+      <w:pPr>
+        <w:spacing w:after="0" w:line="240" w:lineRule="auto"/>
+        <w:rPr>
+          <w:rFonts w:ascii="Calibri" w:hAnsi="Calibri" w:cs="Calibri"/>
+          <w:sz w:val="22"/>
+          <w:szCs w:val="22"/>
+          <w:lang w:val="en-US"/>
+        </w:rPr>
+      </w:pPr>
+      <w:proofErr w:type="gramStart"/>
+      <w:r>
+        <w:rPr>
+          <w:rFonts w:ascii="Calibri" w:hAnsi="Calibri" w:cs="Calibri"/>
+          <w:sz w:val="22"/>
+          <w:szCs w:val="22"/>
+          <w:lang w:val="en-US"/>
+        </w:rPr>
+        <w:t>DRUG(</w:t>
+      </w:r>
+      <w:proofErr w:type="spellStart"/>
+      <w:proofErr w:type="gramEnd"/>
+      <w:r>
+        <w:rPr>
+          <w:rFonts w:ascii="Calibri" w:hAnsi="Calibri" w:cs="Calibri"/>
+          <w:sz w:val="22"/>
+          <w:szCs w:val="22"/>
+          <w:lang w:val="en-US"/>
+        </w:rPr>
+        <w:t>drug_code</w:t>
+      </w:r>
+      <w:proofErr w:type="spellEnd"/>
+      <w:r>
+        <w:rPr>
+          <w:rFonts w:ascii="Calibri" w:hAnsi="Calibri" w:cs="Calibri"/>
+          <w:sz w:val="22"/>
+          <w:szCs w:val="22"/>
+          <w:lang w:val="en-US"/>
+        </w:rPr>
+        <w:t xml:space="preserve">, </w:t>
+      </w:r>
+      <w:proofErr w:type="spellStart"/>
+      <w:r>
+        <w:rPr>
+          <w:rFonts w:ascii="Calibri" w:hAnsi="Calibri" w:cs="Calibri"/>
+          <w:sz w:val="22"/>
+          <w:szCs w:val="22"/>
+          <w:lang w:val="en-US"/>
+        </w:rPr>
+        <w:t>drug_name</w:t>
+      </w:r>
+      <w:proofErr w:type="spellEnd"/>
+      <w:r>
+        <w:rPr>
+          <w:rFonts w:ascii="Calibri" w:hAnsi="Calibri" w:cs="Calibri"/>
+          <w:sz w:val="22"/>
+          <w:szCs w:val="22"/>
+          <w:lang w:val="en-US"/>
+        </w:rPr>
+        <w:t xml:space="preserve">)  </w:t>
+      </w:r>
+    </w:p>
+    <w:p>
+      <w:pPr>
+        <w:spacing w:after="0" w:line="240" w:lineRule="auto"/>
+        <w:rPr>
+          <w:rFonts w:ascii="Calibri" w:hAnsi="Calibri" w:cs="Calibri"/>
+          <w:sz w:val="22"/>
+          <w:szCs w:val="22"/>
+          <w:lang w:val="en-US"/>
+        </w:rPr>
+      </w:pPr>
+      <w:r>
+        <w:rPr>
+          <w:rFonts w:ascii="Calibri" w:hAnsi="Calibri" w:cs="Calibri"/>
+          <w:sz w:val="22"/>
+          <w:szCs w:val="22"/>
+          <w:lang w:val="en-US"/>
+        </w:rPr>
+        <w:t>SALESREP_</w:t>
+      </w:r>
+      <w:proofErr w:type="gramStart"/>
+      <w:r>
+        <w:rPr>
+          <w:rFonts w:ascii="Calibri" w:hAnsi="Calibri" w:cs="Calibri"/>
+          <w:sz w:val="22"/>
+          <w:szCs w:val="22"/>
+          <w:lang w:val="en-US"/>
+        </w:rPr>
+        <w:t>DRUG(</w:t>
+      </w:r>
+      <w:proofErr w:type="spellStart"/>
+      <w:proofErr w:type="gramEnd"/>
+      <w:r>
+        <w:rPr>
+          <w:rFonts w:ascii="Calibri" w:hAnsi="Calibri" w:cs="Calibri"/>
+          <w:sz w:val="22"/>
+          <w:szCs w:val="22"/>
+          <w:lang w:val="en-US"/>
+        </w:rPr>
+        <w:t>salesrep_id</w:t>
+      </w:r>
+      <w:proofErr w:type="spellEnd"/>
+      <w:r>
+        <w:rPr>
+          <w:rFonts w:ascii="Calibri" w:hAnsi="Calibri" w:cs="Calibri"/>
+          <w:sz w:val="22"/>
+          <w:szCs w:val="22"/>
+          <w:lang w:val="en-US"/>
+        </w:rPr>
+        <w:t xml:space="preserve">, </w:t>
+      </w:r>
+      <w:proofErr w:type="spellStart"/>
+      <w:r>
+        <w:rPr>
+          <w:rFonts w:ascii="Calibri" w:hAnsi="Calibri" w:cs="Calibri"/>
+          <w:sz w:val="22"/>
+          <w:szCs w:val="22"/>
+          <w:lang w:val="en-US"/>
+        </w:rPr>
+        <w:t>drug_code</w:t>
+      </w:r>
+      <w:proofErr w:type="spellEnd"/>
+      <w:r>
+        <w:rPr>
+          <w:rFonts w:ascii="Calibri" w:hAnsi="Calibri" w:cs="Calibri"/>
+          <w:sz w:val="22"/>
+          <w:szCs w:val="22"/>
+          <w:lang w:val="en-US"/>
+        </w:rPr>
+        <w:t xml:space="preserve">, </w:t>
+      </w:r>
+      <w:proofErr w:type="spellStart"/>
+      <w:r>
+        <w:rPr>
+          <w:rFonts w:ascii="Calibri" w:hAnsi="Calibri" w:cs="Calibri"/>
+          <w:sz w:val="22"/>
+          <w:szCs w:val="22"/>
+          <w:lang w:val="en-US"/>
+        </w:rPr>
+        <w:t>date_assigned</w:t>
+      </w:r>
+      <w:proofErr w:type="spellEnd"/>
+      <w:r>
+        <w:rPr>
+          <w:rFonts w:ascii="Calibri" w:hAnsi="Calibri" w:cs="Calibri"/>
+          <w:sz w:val="22"/>
+          <w:szCs w:val="22"/>
+          <w:lang w:val="en-US"/>
+        </w:rPr>
+        <w:t xml:space="preserve">)  </w:t>
+      </w:r>
+    </w:p>
+    <w:p>
+      <w:pPr>
+        <w:spacing w:after="0" w:line="240" w:lineRule="auto"/>
+        <w:rPr>
+          <w:rFonts w:ascii="Calibri" w:hAnsi="Calibri" w:cs="Calibri"/>
+          <w:sz w:val="22"/>
+          <w:szCs w:val="22"/>
+          <w:lang w:val="en-US"/>
+        </w:rPr>
+      </w:pPr>
+    </w:p>
+    <w:p>
+      <w:pPr>
+        <w:spacing w:after="0" w:line="240" w:lineRule="auto"/>
+        <w:rPr>
+          <w:rFonts w:ascii="Calibri" w:hAnsi="Calibri" w:cs="Calibri"/>
+          <w:sz w:val="22"/>
+          <w:szCs w:val="22"/>
+          <w:lang w:val="en-US"/>
+        </w:rPr>
+      </w:pPr>
+    </w:p>
+    <w:p>
+      <w:pPr>
+        <w:spacing w:after="0" w:line="240" w:lineRule="auto"/>
+        <w:rPr>
+          <w:rFonts w:ascii="Calibri" w:hAnsi="Calibri" w:cs="Calibri"/>
+          <w:b/>
+          <w:bCs/>
+          <w:sz w:val="22"/>
+          <w:szCs w:val="22"/>
+          <w:lang w:val="en-US"/>
+        </w:rPr>
+      </w:pPr>
+      <w:r>
+        <w:rPr>
+          <w:rFonts w:ascii="Calibri" w:hAnsi="Calibri" w:cs="Calibri"/>
+          <w:b/>
+          <w:bCs/>
+          <w:sz w:val="22"/>
+          <w:szCs w:val="22"/>
+          <w:lang w:val="en-US"/>
+        </w:rPr>
+        <w:t xml:space="preserve">Functional Dependencies  </w:t>
+      </w:r>
+    </w:p>
+    <w:p>
+      <w:pPr>
+        <w:spacing w:after="0" w:line="240" w:lineRule="auto"/>
+        <w:rPr>
+          <w:rFonts w:ascii="Calibri" w:hAnsi="Calibri" w:cs="Calibri"/>
+          <w:sz w:val="22"/>
+          <w:szCs w:val="22"/>
+          <w:lang w:val="en-US"/>
+        </w:rPr>
+      </w:pPr>
+      <w:proofErr w:type="spellStart"/>
+      <w:r>
+        <w:rPr>
+          <w:rFonts w:ascii="Calibri" w:hAnsi="Calibri" w:cs="Calibri"/>
+          <w:sz w:val="22"/>
+          <w:szCs w:val="22"/>
+          <w:lang w:val="en-US"/>
+        </w:rPr>
+        <w:t>salesrep_id</w:t>
+      </w:r>
+      <w:proofErr w:type="spellEnd"/>
+      <w:r>
+        <w:rPr>
+          <w:rFonts w:ascii="Calibri" w:hAnsi="Calibri" w:cs="Calibri"/>
+          <w:sz w:val="22"/>
+          <w:szCs w:val="22"/>
+          <w:lang w:val="en-US"/>
+        </w:rPr>
+        <w:t xml:space="preserve"> → </w:t>
+      </w:r>
+      <w:proofErr w:type="spellStart"/>
+      <w:r>
+        <w:rPr>
+          <w:rFonts w:ascii="Calibri" w:hAnsi="Calibri" w:cs="Calibri"/>
+          <w:sz w:val="22"/>
+          <w:szCs w:val="22"/>
+          <w:lang w:val="en-US"/>
+        </w:rPr>
+        <w:t>salesrep_name</w:t>
+      </w:r>
+      <w:proofErr w:type="spellEnd"/>
+      <w:r>
+        <w:rPr>
+          <w:rFonts w:ascii="Calibri" w:hAnsi="Calibri" w:cs="Calibri"/>
+          <w:sz w:val="22"/>
+          <w:szCs w:val="22"/>
+          <w:lang w:val="en-US"/>
+        </w:rPr>
+        <w:t xml:space="preserve">, </w:t>
+      </w:r>
+      <w:proofErr w:type="spellStart"/>
+      <w:r>
+        <w:rPr>
+          <w:rFonts w:ascii="Calibri" w:hAnsi="Calibri" w:cs="Calibri"/>
+          <w:sz w:val="22"/>
+          <w:szCs w:val="22"/>
+          <w:lang w:val="en-US"/>
+        </w:rPr>
+        <w:t>salesrep_mobile</w:t>
+      </w:r>
+      <w:proofErr w:type="spellEnd"/>
+      <w:r>
+        <w:rPr>
+          <w:rFonts w:ascii="Calibri" w:hAnsi="Calibri" w:cs="Calibri"/>
+          <w:sz w:val="22"/>
+          <w:szCs w:val="22"/>
+          <w:lang w:val="en-US"/>
+        </w:rPr>
+        <w:t xml:space="preserve">, </w:t>
+      </w:r>
+      <w:proofErr w:type="spellStart"/>
+      <w:r>
+        <w:rPr>
+          <w:rFonts w:ascii="Calibri" w:hAnsi="Calibri" w:cs="Calibri"/>
+          <w:sz w:val="22"/>
+          <w:szCs w:val="22"/>
+          <w:lang w:val="en-US"/>
+        </w:rPr>
+        <w:t>branch_id</w:t>
+      </w:r>
+      <w:proofErr w:type="spellEnd"/>
+      <w:r>
+        <w:rPr>
+          <w:rFonts w:ascii="Calibri" w:hAnsi="Calibri" w:cs="Calibri"/>
+          <w:sz w:val="22"/>
+          <w:szCs w:val="22"/>
+          <w:lang w:val="en-US"/>
+        </w:rPr>
+        <w:t xml:space="preserve">  </w:t>
+      </w:r>
+    </w:p>
+    <w:p>
+      <w:pPr>
+        <w:spacing w:after="0" w:line="240" w:lineRule="auto"/>
+        <w:rPr>
+          <w:rFonts w:ascii="Calibri" w:hAnsi="Calibri" w:cs="Calibri"/>
+          <w:sz w:val="22"/>
+          <w:szCs w:val="22"/>
+          <w:lang w:val="en-US"/>
+        </w:rPr>
+      </w:pPr>
+      <w:proofErr w:type="spellStart"/>
+      <w:r>
+        <w:rPr>
+          <w:rFonts w:ascii="Calibri" w:hAnsi="Calibri" w:cs="Calibri"/>
+          <w:sz w:val="22"/>
+          <w:szCs w:val="22"/>
+          <w:lang w:val="en-US"/>
+        </w:rPr>
+        <w:t>branch_id</w:t>
+      </w:r>
+      <w:proofErr w:type="spellEnd"/>
+      <w:r>
+        <w:rPr>
+          <w:rFonts w:ascii="Calibri" w:hAnsi="Calibri" w:cs="Calibri"/>
+          <w:sz w:val="22"/>
+          <w:szCs w:val="22"/>
+          <w:lang w:val="en-US"/>
+        </w:rPr>
+        <w:t xml:space="preserve"> → </w:t>
+      </w:r>
+      <w:proofErr w:type="spellStart"/>
+      <w:r>
+        <w:rPr>
+          <w:rFonts w:ascii="Calibri" w:hAnsi="Calibri" w:cs="Calibri"/>
+          <w:sz w:val="22"/>
+          <w:szCs w:val="22"/>
+          <w:lang w:val="en-US"/>
+        </w:rPr>
+        <w:t>branch_name</w:t>
+      </w:r>
+      <w:proofErr w:type="spellEnd"/>
+      <w:r>
+        <w:rPr>
+          <w:rFonts w:ascii="Calibri" w:hAnsi="Calibri" w:cs="Calibri"/>
+          <w:sz w:val="22"/>
+          <w:szCs w:val="22"/>
+          <w:lang w:val="en-US"/>
+        </w:rPr>
+        <w:t xml:space="preserve">  </w:t>
+      </w:r>
+    </w:p>
+    <w:p>
+      <w:pPr>
+        <w:spacing w:after="0" w:line="240" w:lineRule="auto"/>
+        <w:rPr>
+          <w:rFonts w:ascii="Calibri" w:hAnsi="Calibri" w:cs="Calibri"/>
+          <w:sz w:val="22"/>
+          <w:szCs w:val="22"/>
+          <w:lang w:val="en-US"/>
+        </w:rPr>
+      </w:pPr>
+      <w:proofErr w:type="spellStart"/>
+      <w:r>
+        <w:rPr>
+          <w:rFonts w:ascii="Calibri" w:hAnsi="Calibri" w:cs="Calibri"/>
+          <w:sz w:val="22"/>
+          <w:szCs w:val="22"/>
+          <w:lang w:val="en-US"/>
+        </w:rPr>
+        <w:t>drug_code</w:t>
+      </w:r>
+      <w:proofErr w:type="spellEnd"/>
+      <w:r>
+        <w:rPr>
+          <w:rFonts w:ascii="Calibri" w:hAnsi="Calibri" w:cs="Calibri"/>
+          <w:sz w:val="22"/>
+          <w:szCs w:val="22"/>
+          <w:lang w:val="en-US"/>
+        </w:rPr>
+        <w:t xml:space="preserve"> → </w:t>
+      </w:r>
+      <w:proofErr w:type="spellStart"/>
+      <w:r>
+        <w:rPr>
+          <w:rFonts w:ascii="Calibri" w:hAnsi="Calibri" w:cs="Calibri"/>
+          <w:sz w:val="22"/>
+          <w:szCs w:val="22"/>
+          <w:lang w:val="en-US"/>
+        </w:rPr>
+        <w:t>drug_name</w:t>
+      </w:r>
+      <w:proofErr w:type="spellEnd"/>
+      <w:r>
+        <w:rPr>
+          <w:rFonts w:ascii="Calibri" w:hAnsi="Calibri" w:cs="Calibri"/>
+          <w:sz w:val="22"/>
+          <w:szCs w:val="22"/>
+          <w:lang w:val="en-US"/>
+        </w:rPr>
+        <w:t xml:space="preserve">  </w:t>
+      </w:r>
+    </w:p>
+    <w:p>
+      <w:pPr>
+        <w:spacing w:after="0" w:line="240" w:lineRule="auto"/>
+        <w:rPr>
+          <w:rFonts w:ascii="Calibri" w:hAnsi="Calibri" w:cs="Calibri"/>
+          <w:sz w:val="22"/>
+          <w:szCs w:val="22"/>
+          <w:lang w:val="en-US"/>
+        </w:rPr>
+      </w:pPr>
+      <w:r>
+        <w:rPr>
+          <w:rFonts w:ascii="Calibri" w:hAnsi="Calibri" w:cs="Calibri"/>
+          <w:sz w:val="22"/>
+          <w:szCs w:val="22"/>
+          <w:lang w:val="en-US"/>
+        </w:rPr>
+        <w:t>(</w:t>
+      </w:r>
+      <w:proofErr w:type="spellStart"/>
+      <w:r>
+        <w:rPr>
+          <w:rFonts w:ascii="Calibri" w:hAnsi="Calibri" w:cs="Calibri"/>
+          <w:sz w:val="22"/>
+          <w:szCs w:val="22"/>
+          <w:lang w:val="en-US"/>
+        </w:rPr>
+        <w:t>salesrep_id</w:t>
+      </w:r>
+      <w:proofErr w:type="spellEnd"/>
+      <w:r>
+        <w:rPr>
+          <w:rFonts w:ascii="Calibri" w:hAnsi="Calibri" w:cs="Calibri"/>
+          <w:sz w:val="22"/>
+          <w:szCs w:val="22"/>
+          <w:lang w:val="en-US"/>
+        </w:rPr>
+        <w:t xml:space="preserve">, </w:t>
+      </w:r>
+      <w:proofErr w:type="spellStart"/>
+      <w:r>
+        <w:rPr>
+          <w:rFonts w:ascii="Calibri" w:hAnsi="Calibri" w:cs="Calibri"/>
+          <w:sz w:val="22"/>
+          <w:szCs w:val="22"/>
+          <w:lang w:val="en-US"/>
+        </w:rPr>
+        <w:t>drug_code</w:t>
+      </w:r>
+      <w:proofErr w:type="spellEnd"/>
+      <w:r>
+        <w:rPr>
+          <w:rFonts w:ascii="Calibri" w:hAnsi="Calibri" w:cs="Calibri"/>
+          <w:sz w:val="22"/>
+          <w:szCs w:val="22"/>
+          <w:lang w:val="en-US"/>
+        </w:rPr>
+        <w:t xml:space="preserve">) → </w:t>
+      </w:r>
+      <w:proofErr w:type="spellStart"/>
+      <w:r>
+        <w:rPr>
+          <w:rFonts w:ascii="Calibri" w:hAnsi="Calibri" w:cs="Calibri"/>
+          <w:sz w:val="22"/>
+          <w:szCs w:val="22"/>
+          <w:lang w:val="en-US"/>
+        </w:rPr>
+        <w:t>date_assigned</w:t>
+      </w:r>
+      <w:proofErr w:type="spellEnd"/>
     </w:p>
     <w:sectPr>
       <w:pgSz w:w="11906" w:h="16838"/>

</xml_diff>

<commit_message>
saved as pdf and submitted to moodle
</commit_message>
<xml_diff>
--- a/Applied/App04/at4_normalisation.docx
+++ b/Applied/App04/at4_normalisation.docx
@@ -107,7 +107,10 @@
           <w:lang w:val="en-US"/>
         </w:rPr>
       </w:pPr>
-      <w:r>
+    </w:p>
+    <w:p>
+      <w:pPr>
+        <w:spacing w:after="0" w:line="240" w:lineRule="auto"/>
         <w:rPr>
           <w:rFonts w:ascii="Calibri" w:hAnsi="Calibri" w:cs="Calibri"/>
           <w:b/>
@@ -116,6 +119,16 @@
           <w:szCs w:val="22"/>
           <w:lang w:val="en-US"/>
         </w:rPr>
+      </w:pPr>
+      <w:r>
+        <w:rPr>
+          <w:rFonts w:ascii="Calibri" w:hAnsi="Calibri" w:cs="Calibri"/>
+          <w:b/>
+          <w:bCs/>
+          <w:sz w:val="22"/>
+          <w:szCs w:val="22"/>
+          <w:lang w:val="en-US"/>
+        </w:rPr>
         <w:t xml:space="preserve">UNF  </w:t>
       </w:r>
     </w:p>
@@ -306,6 +319,19 @@
         <w:spacing w:after="0" w:line="240" w:lineRule="auto"/>
         <w:rPr>
           <w:rFonts w:ascii="Calibri" w:hAnsi="Calibri" w:cs="Calibri"/>
+          <w:sz w:val="22"/>
+          <w:szCs w:val="22"/>
+          <w:lang w:val="en-US"/>
+        </w:rPr>
+      </w:pPr>
+    </w:p>
+    <w:p>
+      <w:pPr>
+        <w:spacing w:after="0" w:line="240" w:lineRule="auto"/>
+        <w:rPr>
+          <w:rFonts w:ascii="Calibri" w:hAnsi="Calibri" w:cs="Calibri"/>
+          <w:b/>
+          <w:bCs/>
           <w:sz w:val="22"/>
           <w:szCs w:val="22"/>
           <w:lang w:val="en-US"/>

</xml_diff>